<commit_message>
resolve alguns pontos de 'A PREENCHER'
</commit_message>
<xml_diff>
--- a/TCC_UNIP_Consumo_Residencial_VERSAO_LIMPA.docx
+++ b/TCC_UNIP_Consumo_Residencial_VERSAO_LIMPA.docx
@@ -7295,25 +7295,6 @@
     </w:p>
     <w:p>
       <w:pPr>
-        <w:spacing w:after="240" w:before="240" w:line="360"/>
-        <w:jc w:val="center"/>
-      </w:pPr>
-      <w:r>
-        <w:rPr>
-          <w:rFonts w:ascii="Arial" w:cs="Arial" w:eastAsia="Arial" w:hAnsi="Arial"/>
-          <w:b/>
-          <w:bCs/>
-          <w:i w:val="false"/>
-          <w:iCs w:val="false"/>
-          <w:caps w:val="false"/>
-          <w:sz w:val="24"/>
-          <w:szCs w:val="24"/>
-        </w:rPr>
-        <w:t xml:space="preserve">[A PREENCHER: descrição do modelo LSTM, caso seja incluído]</w:t>
-      </w:r>
-    </w:p>
-    <w:p>
-      <w:pPr>
         <w:pStyle w:val="Heading3"/>
         <w:spacing w:after="160" w:before="280" w:line="360"/>
         <w:jc w:val="left"/>
@@ -10774,7 +10755,7 @@
                 <w:sz w:val="20"/>
                 <w:szCs w:val="20"/>
               </w:rPr>
-              <w:t xml:space="preserve">O custo total dos componentes de hardware de um nó sensor não deve exceder R$ 200,00.</w:t>
+              <w:t xml:space="preserve">O custo dos componentes de hardware de um nó de medição não deve exceder R$ 200,00, excluídos os instrumentos de aferição e o circuito instrumentado.</w:t>
             </w:r>
           </w:p>
         </w:tc>
@@ -10866,7 +10847,7 @@
                 <w:sz w:val="20"/>
                 <w:szCs w:val="20"/>
               </w:rPr>
-              <w:t xml:space="preserve">A infraestrutura em nuvem deve operar em camada gratuita ou de custo mensal inferior a R$ 50,00.</w:t>
+              <w:t xml:space="preserve">A infraestrutura em nuvem deve operar integralmente dentro dos limites das camadas gratuitas dos provedores adotados.</w:t>
             </w:r>
           </w:p>
         </w:tc>
@@ -14942,10 +14923,10 @@
         </w:tblBorders>
       </w:tblPr>
       <w:tblGrid>
-        <w:gridCol w:w="2300"/>
-        <w:gridCol w:w="3200"/>
-        <w:gridCol w:w="1500"/>
-        <w:gridCol w:w="3100"/>
+        <w:gridCol w:w="2100"/>
+        <w:gridCol w:w="2600"/>
+        <w:gridCol w:w="4000"/>
+        <w:gridCol w:w="1400"/>
       </w:tblGrid>
       <w:tr>
         <w:trPr>
@@ -14953,7 +14934,7 @@
         </w:trPr>
         <w:tc>
           <w:tcPr>
-            <w:tcW w:type="dxa" w:w="2300"/>
+            <w:tcW w:type="dxa" w:w="2100"/>
             <w:shd w:fill="D9D9D9" w:color="auto" w:val="clear"/>
             <w:tcMar>
               <w:top w:type="dxa" w:w="60"/>
@@ -14984,7 +14965,7 @@
         </w:tc>
         <w:tc>
           <w:tcPr>
-            <w:tcW w:type="dxa" w:w="3200"/>
+            <w:tcW w:type="dxa" w:w="2600"/>
             <w:shd w:fill="D9D9D9" w:color="auto" w:val="clear"/>
             <w:tcMar>
               <w:top w:type="dxa" w:w="60"/>
@@ -15015,7 +14996,7 @@
         </w:tc>
         <w:tc>
           <w:tcPr>
-            <w:tcW w:type="dxa" w:w="1500"/>
+            <w:tcW w:type="dxa" w:w="4000"/>
             <w:shd w:fill="D9D9D9" w:color="auto" w:val="clear"/>
             <w:tcMar>
               <w:top w:type="dxa" w:w="60"/>
@@ -15040,13 +15021,13 @@
                 <w:sz w:val="20"/>
                 <w:szCs w:val="20"/>
               </w:rPr>
-              <w:t xml:space="preserve">Modelo</w:t>
-            </w:r>
-          </w:p>
-        </w:tc>
-        <w:tc>
-          <w:tcPr>
-            <w:tcW w:type="dxa" w:w="3100"/>
+              <w:t xml:space="preserve">Limite da camada gratuita</w:t>
+            </w:r>
+          </w:p>
+        </w:tc>
+        <w:tc>
+          <w:tcPr>
+            <w:tcW w:type="dxa" w:w="1400"/>
             <w:shd w:fill="D9D9D9" w:color="auto" w:val="clear"/>
             <w:tcMar>
               <w:top w:type="dxa" w:w="60"/>
@@ -15071,7 +15052,7 @@
                 <w:sz w:val="20"/>
                 <w:szCs w:val="20"/>
               </w:rPr>
-              <w:t xml:space="preserve">Custo estimado</w:t>
+              <w:t xml:space="preserve">Custo</w:t>
             </w:r>
           </w:p>
         </w:tc>
@@ -15079,7 +15060,7 @@
       <w:tr>
         <w:tc>
           <w:tcPr>
-            <w:tcW w:type="dxa" w:w="2300"/>
+            <w:tcW w:type="dxa" w:w="2100"/>
             <w:tcMar>
               <w:top w:type="dxa" w:w="60"/>
               <w:left w:type="dxa" w:w="90"/>
@@ -15109,91 +15090,91 @@
         </w:tc>
         <w:tc>
           <w:tcPr>
-            <w:tcW w:type="dxa" w:w="3200"/>
-            <w:tcMar>
-              <w:top w:type="dxa" w:w="60"/>
-              <w:left w:type="dxa" w:w="90"/>
-              <w:bottom w:type="dxa" w:w="60"/>
-              <w:right w:type="dxa" w:w="90"/>
-            </w:tcMar>
-          </w:tcPr>
-          <w:p>
-            <w:pPr>
-              <w:spacing w:line="240"/>
-              <w:jc w:val="left"/>
-            </w:pPr>
-            <w:r>
-              <w:rPr>
-                <w:rFonts w:ascii="Arial" w:cs="Arial" w:eastAsia="Arial" w:hAnsi="Arial"/>
-                <w:b w:val="false"/>
-                <w:bCs w:val="false"/>
-                <w:i w:val="false"/>
-                <w:iCs w:val="false"/>
-                <w:caps w:val="false"/>
-                <w:sz w:val="20"/>
-                <w:szCs w:val="20"/>
-              </w:rPr>
-              <w:t xml:space="preserve">HiveMQ Cloud – camada gratuita</w:t>
-            </w:r>
-          </w:p>
-        </w:tc>
-        <w:tc>
-          <w:tcPr>
-            <w:tcW w:type="dxa" w:w="1500"/>
-            <w:tcMar>
-              <w:top w:type="dxa" w:w="60"/>
-              <w:left w:type="dxa" w:w="90"/>
-              <w:bottom w:type="dxa" w:w="60"/>
-              <w:right w:type="dxa" w:w="90"/>
-            </w:tcMar>
-          </w:tcPr>
-          <w:p>
-            <w:pPr>
-              <w:spacing w:line="240"/>
-              <w:jc w:val="left"/>
-            </w:pPr>
-            <w:r>
-              <w:rPr>
-                <w:rFonts w:ascii="Arial" w:cs="Arial" w:eastAsia="Arial" w:hAnsi="Arial"/>
-                <w:b w:val="false"/>
-                <w:bCs w:val="false"/>
-                <w:i w:val="false"/>
-                <w:iCs w:val="false"/>
-                <w:caps w:val="false"/>
-                <w:sz w:val="20"/>
-                <w:szCs w:val="20"/>
-              </w:rPr>
-              <w:t xml:space="preserve">SaaS</w:t>
-            </w:r>
-          </w:p>
-        </w:tc>
-        <w:tc>
-          <w:tcPr>
-            <w:tcW w:type="dxa" w:w="3100"/>
-            <w:tcMar>
-              <w:top w:type="dxa" w:w="60"/>
-              <w:left w:type="dxa" w:w="90"/>
-              <w:bottom w:type="dxa" w:w="60"/>
-              <w:right w:type="dxa" w:w="90"/>
-            </w:tcMar>
-          </w:tcPr>
-          <w:p>
-            <w:pPr>
-              <w:spacing w:line="240"/>
-              <w:jc w:val="left"/>
-            </w:pPr>
-            <w:r>
-              <w:rPr>
-                <w:rFonts w:ascii="Arial" w:cs="Arial" w:eastAsia="Arial" w:hAnsi="Arial"/>
-                <w:b w:val="false"/>
-                <w:bCs w:val="false"/>
-                <w:i w:val="false"/>
-                <w:iCs w:val="false"/>
-                <w:caps w:val="false"/>
-                <w:sz w:val="20"/>
-                <w:szCs w:val="20"/>
-              </w:rPr>
-              <w:t xml:space="preserve">Sem custo (até 100 conexões)</w:t>
+            <w:tcW w:type="dxa" w:w="2600"/>
+            <w:tcMar>
+              <w:top w:type="dxa" w:w="60"/>
+              <w:left w:type="dxa" w:w="90"/>
+              <w:bottom w:type="dxa" w:w="60"/>
+              <w:right w:type="dxa" w:w="90"/>
+            </w:tcMar>
+          </w:tcPr>
+          <w:p>
+            <w:pPr>
+              <w:spacing w:line="240"/>
+              <w:jc w:val="left"/>
+            </w:pPr>
+            <w:r>
+              <w:rPr>
+                <w:rFonts w:ascii="Arial" w:cs="Arial" w:eastAsia="Arial" w:hAnsi="Arial"/>
+                <w:b w:val="false"/>
+                <w:bCs w:val="false"/>
+                <w:i w:val="false"/>
+                <w:iCs w:val="false"/>
+                <w:caps w:val="false"/>
+                <w:sz w:val="20"/>
+                <w:szCs w:val="20"/>
+              </w:rPr>
+              <w:t xml:space="preserve">HiveMQ Cloud Serverless</w:t>
+            </w:r>
+          </w:p>
+        </w:tc>
+        <w:tc>
+          <w:tcPr>
+            <w:tcW w:type="dxa" w:w="4000"/>
+            <w:tcMar>
+              <w:top w:type="dxa" w:w="60"/>
+              <w:left w:type="dxa" w:w="90"/>
+              <w:bottom w:type="dxa" w:w="60"/>
+              <w:right w:type="dxa" w:w="90"/>
+            </w:tcMar>
+          </w:tcPr>
+          <w:p>
+            <w:pPr>
+              <w:spacing w:line="240"/>
+              <w:jc w:val="left"/>
+            </w:pPr>
+            <w:r>
+              <w:rPr>
+                <w:rFonts w:ascii="Arial" w:cs="Arial" w:eastAsia="Arial" w:hAnsi="Arial"/>
+                <w:b w:val="false"/>
+                <w:bCs w:val="false"/>
+                <w:i w:val="false"/>
+                <w:iCs w:val="false"/>
+                <w:caps w:val="false"/>
+                <w:sz w:val="20"/>
+                <w:szCs w:val="20"/>
+              </w:rPr>
+              <w:t xml:space="preserve">100 conexões simultâneas; 10 GB de tráfego mensal; MQTT sobre TLS</w:t>
+            </w:r>
+          </w:p>
+        </w:tc>
+        <w:tc>
+          <w:tcPr>
+            <w:tcW w:type="dxa" w:w="1400"/>
+            <w:tcMar>
+              <w:top w:type="dxa" w:w="60"/>
+              <w:left w:type="dxa" w:w="90"/>
+              <w:bottom w:type="dxa" w:w="60"/>
+              <w:right w:type="dxa" w:w="90"/>
+            </w:tcMar>
+          </w:tcPr>
+          <w:p>
+            <w:pPr>
+              <w:spacing w:line="240"/>
+              <w:jc w:val="left"/>
+            </w:pPr>
+            <w:r>
+              <w:rPr>
+                <w:rFonts w:ascii="Arial" w:cs="Arial" w:eastAsia="Arial" w:hAnsi="Arial"/>
+                <w:b w:val="false"/>
+                <w:bCs w:val="false"/>
+                <w:i w:val="false"/>
+                <w:iCs w:val="false"/>
+                <w:caps w:val="false"/>
+                <w:sz w:val="20"/>
+                <w:szCs w:val="20"/>
+              </w:rPr>
+              <w:t xml:space="preserve">Sem custo</w:t>
             </w:r>
           </w:p>
         </w:tc>
@@ -15201,121 +15182,121 @@
       <w:tr>
         <w:tc>
           <w:tcPr>
-            <w:tcW w:type="dxa" w:w="2300"/>
-            <w:tcMar>
-              <w:top w:type="dxa" w:w="60"/>
-              <w:left w:type="dxa" w:w="90"/>
-              <w:bottom w:type="dxa" w:w="60"/>
-              <w:right w:type="dxa" w:w="90"/>
-            </w:tcMar>
-          </w:tcPr>
-          <w:p>
-            <w:pPr>
-              <w:spacing w:line="240"/>
-              <w:jc w:val="left"/>
-            </w:pPr>
-            <w:r>
-              <w:rPr>
-                <w:rFonts w:ascii="Arial" w:cs="Arial" w:eastAsia="Arial" w:hAnsi="Arial"/>
-                <w:b w:val="false"/>
-                <w:bCs w:val="false"/>
-                <w:i w:val="false"/>
-                <w:iCs w:val="false"/>
-                <w:caps w:val="false"/>
-                <w:sz w:val="20"/>
-                <w:szCs w:val="20"/>
-              </w:rPr>
-              <w:t xml:space="preserve">Serviço de ingestão e API</w:t>
-            </w:r>
-          </w:p>
-        </w:tc>
-        <w:tc>
-          <w:tcPr>
-            <w:tcW w:type="dxa" w:w="3200"/>
-            <w:tcMar>
-              <w:top w:type="dxa" w:w="60"/>
-              <w:left w:type="dxa" w:w="90"/>
-              <w:bottom w:type="dxa" w:w="60"/>
-              <w:right w:type="dxa" w:w="90"/>
-            </w:tcMar>
-          </w:tcPr>
-          <w:p>
-            <w:pPr>
-              <w:spacing w:line="240"/>
-              <w:jc w:val="left"/>
-            </w:pPr>
-            <w:r>
-              <w:rPr>
-                <w:rFonts w:ascii="Arial" w:cs="Arial" w:eastAsia="Arial" w:hAnsi="Arial"/>
-                <w:b w:val="false"/>
-                <w:bCs w:val="false"/>
-                <w:i w:val="false"/>
-                <w:iCs w:val="false"/>
-                <w:caps w:val="false"/>
-                <w:sz w:val="20"/>
-                <w:szCs w:val="20"/>
-              </w:rPr>
-              <w:t xml:space="preserve">Render – serviço web em contêiner</w:t>
-            </w:r>
-          </w:p>
-        </w:tc>
-        <w:tc>
-          <w:tcPr>
-            <w:tcW w:type="dxa" w:w="1500"/>
-            <w:tcMar>
-              <w:top w:type="dxa" w:w="60"/>
-              <w:left w:type="dxa" w:w="90"/>
-              <w:bottom w:type="dxa" w:w="60"/>
-              <w:right w:type="dxa" w:w="90"/>
-            </w:tcMar>
-          </w:tcPr>
-          <w:p>
-            <w:pPr>
-              <w:spacing w:line="240"/>
-              <w:jc w:val="left"/>
-            </w:pPr>
-            <w:r>
-              <w:rPr>
-                <w:rFonts w:ascii="Arial" w:cs="Arial" w:eastAsia="Arial" w:hAnsi="Arial"/>
-                <w:b w:val="false"/>
-                <w:bCs w:val="false"/>
-                <w:i w:val="false"/>
-                <w:iCs w:val="false"/>
-                <w:caps w:val="false"/>
-                <w:sz w:val="20"/>
-                <w:szCs w:val="20"/>
-              </w:rPr>
-              <w:t xml:space="preserve">PaaS</w:t>
-            </w:r>
-          </w:p>
-        </w:tc>
-        <w:tc>
-          <w:tcPr>
-            <w:tcW w:type="dxa" w:w="3100"/>
-            <w:tcMar>
-              <w:top w:type="dxa" w:w="60"/>
-              <w:left w:type="dxa" w:w="90"/>
-              <w:bottom w:type="dxa" w:w="60"/>
-              <w:right w:type="dxa" w:w="90"/>
-            </w:tcMar>
-          </w:tcPr>
-          <w:p>
-            <w:pPr>
-              <w:spacing w:line="240"/>
-              <w:jc w:val="left"/>
-            </w:pPr>
-            <w:r>
-              <w:rPr>
-                <w:rFonts w:ascii="Arial" w:cs="Arial" w:eastAsia="Arial" w:hAnsi="Arial"/>
-                <w:b w:val="false"/>
-                <w:bCs w:val="false"/>
-                <w:i w:val="false"/>
-                <w:iCs w:val="false"/>
-                <w:caps w:val="false"/>
-                <w:sz w:val="20"/>
-                <w:szCs w:val="20"/>
-              </w:rPr>
-              <w:t xml:space="preserve">Sem custo na camada gratuita</w:t>
+            <w:tcW w:type="dxa" w:w="2100"/>
+            <w:tcMar>
+              <w:top w:type="dxa" w:w="60"/>
+              <w:left w:type="dxa" w:w="90"/>
+              <w:bottom w:type="dxa" w:w="60"/>
+              <w:right w:type="dxa" w:w="90"/>
+            </w:tcMar>
+          </w:tcPr>
+          <w:p>
+            <w:pPr>
+              <w:spacing w:line="240"/>
+              <w:jc w:val="left"/>
+            </w:pPr>
+            <w:r>
+              <w:rPr>
+                <w:rFonts w:ascii="Arial" w:cs="Arial" w:eastAsia="Arial" w:hAnsi="Arial"/>
+                <w:b w:val="false"/>
+                <w:bCs w:val="false"/>
+                <w:i w:val="false"/>
+                <w:iCs w:val="false"/>
+                <w:caps w:val="false"/>
+                <w:sz w:val="20"/>
+                <w:szCs w:val="20"/>
+              </w:rPr>
+              <w:t xml:space="preserve">Banco de dados</w:t>
+            </w:r>
+          </w:p>
+        </w:tc>
+        <w:tc>
+          <w:tcPr>
+            <w:tcW w:type="dxa" w:w="2600"/>
+            <w:tcMar>
+              <w:top w:type="dxa" w:w="60"/>
+              <w:left w:type="dxa" w:w="90"/>
+              <w:bottom w:type="dxa" w:w="60"/>
+              <w:right w:type="dxa" w:w="90"/>
+            </w:tcMar>
+          </w:tcPr>
+          <w:p>
+            <w:pPr>
+              <w:spacing w:line="240"/>
+              <w:jc w:val="left"/>
+            </w:pPr>
+            <w:r>
+              <w:rPr>
+                <w:rFonts w:ascii="Arial" w:cs="Arial" w:eastAsia="Arial" w:hAnsi="Arial"/>
+                <w:b w:val="false"/>
+                <w:bCs w:val="false"/>
+                <w:i w:val="false"/>
+                <w:iCs w:val="false"/>
+                <w:caps w:val="false"/>
+                <w:sz w:val="20"/>
+                <w:szCs w:val="20"/>
+              </w:rPr>
+              <w:t xml:space="preserve">Supabase – PostgreSQL gerenciado</w:t>
+            </w:r>
+          </w:p>
+        </w:tc>
+        <w:tc>
+          <w:tcPr>
+            <w:tcW w:type="dxa" w:w="4000"/>
+            <w:tcMar>
+              <w:top w:type="dxa" w:w="60"/>
+              <w:left w:type="dxa" w:w="90"/>
+              <w:bottom w:type="dxa" w:w="60"/>
+              <w:right w:type="dxa" w:w="90"/>
+            </w:tcMar>
+          </w:tcPr>
+          <w:p>
+            <w:pPr>
+              <w:spacing w:line="240"/>
+              <w:jc w:val="left"/>
+            </w:pPr>
+            <w:r>
+              <w:rPr>
+                <w:rFonts w:ascii="Arial" w:cs="Arial" w:eastAsia="Arial" w:hAnsi="Arial"/>
+                <w:b w:val="false"/>
+                <w:bCs w:val="false"/>
+                <w:i w:val="false"/>
+                <w:iCs w:val="false"/>
+                <w:caps w:val="false"/>
+                <w:sz w:val="20"/>
+                <w:szCs w:val="20"/>
+              </w:rPr>
+              <w:t xml:space="preserve">500 MB de armazenamento; 5 GB de tráfego de saída mensal</w:t>
+            </w:r>
+          </w:p>
+        </w:tc>
+        <w:tc>
+          <w:tcPr>
+            <w:tcW w:type="dxa" w:w="1400"/>
+            <w:tcMar>
+              <w:top w:type="dxa" w:w="60"/>
+              <w:left w:type="dxa" w:w="90"/>
+              <w:bottom w:type="dxa" w:w="60"/>
+              <w:right w:type="dxa" w:w="90"/>
+            </w:tcMar>
+          </w:tcPr>
+          <w:p>
+            <w:pPr>
+              <w:spacing w:line="240"/>
+              <w:jc w:val="left"/>
+            </w:pPr>
+            <w:r>
+              <w:rPr>
+                <w:rFonts w:ascii="Arial" w:cs="Arial" w:eastAsia="Arial" w:hAnsi="Arial"/>
+                <w:b w:val="false"/>
+                <w:bCs w:val="false"/>
+                <w:i w:val="false"/>
+                <w:iCs w:val="false"/>
+                <w:caps w:val="false"/>
+                <w:sz w:val="20"/>
+                <w:szCs w:val="20"/>
+              </w:rPr>
+              <w:t xml:space="preserve">Sem custo</w:t>
             </w:r>
           </w:p>
         </w:tc>
@@ -15323,121 +15304,121 @@
       <w:tr>
         <w:tc>
           <w:tcPr>
-            <w:tcW w:type="dxa" w:w="2300"/>
-            <w:tcMar>
-              <w:top w:type="dxa" w:w="60"/>
-              <w:left w:type="dxa" w:w="90"/>
-              <w:bottom w:type="dxa" w:w="60"/>
-              <w:right w:type="dxa" w:w="90"/>
-            </w:tcMar>
-          </w:tcPr>
-          <w:p>
-            <w:pPr>
-              <w:spacing w:line="240"/>
-              <w:jc w:val="left"/>
-            </w:pPr>
-            <w:r>
-              <w:rPr>
-                <w:rFonts w:ascii="Arial" w:cs="Arial" w:eastAsia="Arial" w:hAnsi="Arial"/>
-                <w:b w:val="false"/>
-                <w:bCs w:val="false"/>
-                <w:i w:val="false"/>
-                <w:iCs w:val="false"/>
-                <w:caps w:val="false"/>
-                <w:sz w:val="20"/>
-                <w:szCs w:val="20"/>
-              </w:rPr>
-              <w:t xml:space="preserve">Banco de dados</w:t>
-            </w:r>
-          </w:p>
-        </w:tc>
-        <w:tc>
-          <w:tcPr>
-            <w:tcW w:type="dxa" w:w="3200"/>
-            <w:tcMar>
-              <w:top w:type="dxa" w:w="60"/>
-              <w:left w:type="dxa" w:w="90"/>
-              <w:bottom w:type="dxa" w:w="60"/>
-              <w:right w:type="dxa" w:w="90"/>
-            </w:tcMar>
-          </w:tcPr>
-          <w:p>
-            <w:pPr>
-              <w:spacing w:line="240"/>
-              <w:jc w:val="left"/>
-            </w:pPr>
-            <w:r>
-              <w:rPr>
-                <w:rFonts w:ascii="Arial" w:cs="Arial" w:eastAsia="Arial" w:hAnsi="Arial"/>
-                <w:b w:val="false"/>
-                <w:bCs w:val="false"/>
-                <w:i w:val="false"/>
-                <w:iCs w:val="false"/>
-                <w:caps w:val="false"/>
-                <w:sz w:val="20"/>
-                <w:szCs w:val="20"/>
-              </w:rPr>
-              <w:t xml:space="preserve">Supabase / Neon – PostgreSQL gerenciado</w:t>
-            </w:r>
-          </w:p>
-        </w:tc>
-        <w:tc>
-          <w:tcPr>
-            <w:tcW w:type="dxa" w:w="1500"/>
-            <w:tcMar>
-              <w:top w:type="dxa" w:w="60"/>
-              <w:left w:type="dxa" w:w="90"/>
-              <w:bottom w:type="dxa" w:w="60"/>
-              <w:right w:type="dxa" w:w="90"/>
-            </w:tcMar>
-          </w:tcPr>
-          <w:p>
-            <w:pPr>
-              <w:spacing w:line="240"/>
-              <w:jc w:val="left"/>
-            </w:pPr>
-            <w:r>
-              <w:rPr>
-                <w:rFonts w:ascii="Arial" w:cs="Arial" w:eastAsia="Arial" w:hAnsi="Arial"/>
-                <w:b w:val="false"/>
-                <w:bCs w:val="false"/>
-                <w:i w:val="false"/>
-                <w:iCs w:val="false"/>
-                <w:caps w:val="false"/>
-                <w:sz w:val="20"/>
-                <w:szCs w:val="20"/>
-              </w:rPr>
-              <w:t xml:space="preserve">DBaaS</w:t>
-            </w:r>
-          </w:p>
-        </w:tc>
-        <w:tc>
-          <w:tcPr>
-            <w:tcW w:type="dxa" w:w="3100"/>
-            <w:tcMar>
-              <w:top w:type="dxa" w:w="60"/>
-              <w:left w:type="dxa" w:w="90"/>
-              <w:bottom w:type="dxa" w:w="60"/>
-              <w:right w:type="dxa" w:w="90"/>
-            </w:tcMar>
-          </w:tcPr>
-          <w:p>
-            <w:pPr>
-              <w:spacing w:line="240"/>
-              <w:jc w:val="left"/>
-            </w:pPr>
-            <w:r>
-              <w:rPr>
-                <w:rFonts w:ascii="Arial" w:cs="Arial" w:eastAsia="Arial" w:hAnsi="Arial"/>
-                <w:b w:val="false"/>
-                <w:bCs w:val="false"/>
-                <w:i w:val="false"/>
-                <w:iCs w:val="false"/>
-                <w:caps w:val="false"/>
-                <w:sz w:val="20"/>
-                <w:szCs w:val="20"/>
-              </w:rPr>
-              <w:t xml:space="preserve">Sem custo até o limite de armazenamento</w:t>
+            <w:tcW w:type="dxa" w:w="2100"/>
+            <w:tcMar>
+              <w:top w:type="dxa" w:w="60"/>
+              <w:left w:type="dxa" w:w="90"/>
+              <w:bottom w:type="dxa" w:w="60"/>
+              <w:right w:type="dxa" w:w="90"/>
+            </w:tcMar>
+          </w:tcPr>
+          <w:p>
+            <w:pPr>
+              <w:spacing w:line="240"/>
+              <w:jc w:val="left"/>
+            </w:pPr>
+            <w:r>
+              <w:rPr>
+                <w:rFonts w:ascii="Arial" w:cs="Arial" w:eastAsia="Arial" w:hAnsi="Arial"/>
+                <w:b w:val="false"/>
+                <w:bCs w:val="false"/>
+                <w:i w:val="false"/>
+                <w:iCs w:val="false"/>
+                <w:caps w:val="false"/>
+                <w:sz w:val="20"/>
+                <w:szCs w:val="20"/>
+              </w:rPr>
+              <w:t xml:space="preserve">Serviço de ingestão e API</w:t>
+            </w:r>
+          </w:p>
+        </w:tc>
+        <w:tc>
+          <w:tcPr>
+            <w:tcW w:type="dxa" w:w="2600"/>
+            <w:tcMar>
+              <w:top w:type="dxa" w:w="60"/>
+              <w:left w:type="dxa" w:w="90"/>
+              <w:bottom w:type="dxa" w:w="60"/>
+              <w:right w:type="dxa" w:w="90"/>
+            </w:tcMar>
+          </w:tcPr>
+          <w:p>
+            <w:pPr>
+              <w:spacing w:line="240"/>
+              <w:jc w:val="left"/>
+            </w:pPr>
+            <w:r>
+              <w:rPr>
+                <w:rFonts w:ascii="Arial" w:cs="Arial" w:eastAsia="Arial" w:hAnsi="Arial"/>
+                <w:b w:val="false"/>
+                <w:bCs w:val="false"/>
+                <w:i w:val="false"/>
+                <w:iCs w:val="false"/>
+                <w:caps w:val="false"/>
+                <w:sz w:val="20"/>
+                <w:szCs w:val="20"/>
+              </w:rPr>
+              <w:t xml:space="preserve">Render – serviço web em contêiner</w:t>
+            </w:r>
+          </w:p>
+        </w:tc>
+        <w:tc>
+          <w:tcPr>
+            <w:tcW w:type="dxa" w:w="4000"/>
+            <w:tcMar>
+              <w:top w:type="dxa" w:w="60"/>
+              <w:left w:type="dxa" w:w="90"/>
+              <w:bottom w:type="dxa" w:w="60"/>
+              <w:right w:type="dxa" w:w="90"/>
+            </w:tcMar>
+          </w:tcPr>
+          <w:p>
+            <w:pPr>
+              <w:spacing w:line="240"/>
+              <w:jc w:val="left"/>
+            </w:pPr>
+            <w:r>
+              <w:rPr>
+                <w:rFonts w:ascii="Arial" w:cs="Arial" w:eastAsia="Arial" w:hAnsi="Arial"/>
+                <w:b w:val="false"/>
+                <w:bCs w:val="false"/>
+                <w:i w:val="false"/>
+                <w:iCs w:val="false"/>
+                <w:caps w:val="false"/>
+                <w:sz w:val="20"/>
+                <w:szCs w:val="20"/>
+              </w:rPr>
+              <w:t xml:space="preserve">Camada gratuita para serviço web</w:t>
+            </w:r>
+          </w:p>
+        </w:tc>
+        <w:tc>
+          <w:tcPr>
+            <w:tcW w:type="dxa" w:w="1400"/>
+            <w:tcMar>
+              <w:top w:type="dxa" w:w="60"/>
+              <w:left w:type="dxa" w:w="90"/>
+              <w:bottom w:type="dxa" w:w="60"/>
+              <w:right w:type="dxa" w:w="90"/>
+            </w:tcMar>
+          </w:tcPr>
+          <w:p>
+            <w:pPr>
+              <w:spacing w:line="240"/>
+              <w:jc w:val="left"/>
+            </w:pPr>
+            <w:r>
+              <w:rPr>
+                <w:rFonts w:ascii="Arial" w:cs="Arial" w:eastAsia="Arial" w:hAnsi="Arial"/>
+                <w:b w:val="false"/>
+                <w:bCs w:val="false"/>
+                <w:i w:val="false"/>
+                <w:iCs w:val="false"/>
+                <w:caps w:val="false"/>
+                <w:sz w:val="20"/>
+                <w:szCs w:val="20"/>
+              </w:rPr>
+              <w:t xml:space="preserve">Sem custo</w:t>
             </w:r>
           </w:p>
         </w:tc>
@@ -15445,7 +15426,7 @@
       <w:tr>
         <w:tc>
           <w:tcPr>
-            <w:tcW w:type="dxa" w:w="2300"/>
+            <w:tcW w:type="dxa" w:w="2100"/>
             <w:tcMar>
               <w:top w:type="dxa" w:w="60"/>
               <w:left w:type="dxa" w:w="90"/>
@@ -15475,67 +15456,67 @@
         </w:tc>
         <w:tc>
           <w:tcPr>
-            <w:tcW w:type="dxa" w:w="3200"/>
-            <w:tcMar>
-              <w:top w:type="dxa" w:w="60"/>
-              <w:left w:type="dxa" w:w="90"/>
-              <w:bottom w:type="dxa" w:w="60"/>
-              <w:right w:type="dxa" w:w="90"/>
-            </w:tcMar>
-          </w:tcPr>
-          <w:p>
-            <w:pPr>
-              <w:spacing w:line="240"/>
-              <w:jc w:val="left"/>
-            </w:pPr>
-            <w:r>
-              <w:rPr>
-                <w:rFonts w:ascii="Arial" w:cs="Arial" w:eastAsia="Arial" w:hAnsi="Arial"/>
-                <w:b w:val="false"/>
-                <w:bCs w:val="false"/>
-                <w:i w:val="false"/>
-                <w:iCs w:val="false"/>
-                <w:caps w:val="false"/>
-                <w:sz w:val="20"/>
-                <w:szCs w:val="20"/>
-              </w:rPr>
-              <w:t xml:space="preserve">Cron job do provedor de aplicação</w:t>
-            </w:r>
-          </w:p>
-        </w:tc>
-        <w:tc>
-          <w:tcPr>
-            <w:tcW w:type="dxa" w:w="1500"/>
-            <w:tcMar>
-              <w:top w:type="dxa" w:w="60"/>
-              <w:left w:type="dxa" w:w="90"/>
-              <w:bottom w:type="dxa" w:w="60"/>
-              <w:right w:type="dxa" w:w="90"/>
-            </w:tcMar>
-          </w:tcPr>
-          <w:p>
-            <w:pPr>
-              <w:spacing w:line="240"/>
-              <w:jc w:val="left"/>
-            </w:pPr>
-            <w:r>
-              <w:rPr>
-                <w:rFonts w:ascii="Arial" w:cs="Arial" w:eastAsia="Arial" w:hAnsi="Arial"/>
-                <w:b w:val="false"/>
-                <w:bCs w:val="false"/>
-                <w:i w:val="false"/>
-                <w:iCs w:val="false"/>
-                <w:caps w:val="false"/>
-                <w:sz w:val="20"/>
-                <w:szCs w:val="20"/>
-              </w:rPr>
-              <w:t xml:space="preserve">PaaS</w:t>
-            </w:r>
-          </w:p>
-        </w:tc>
-        <w:tc>
-          <w:tcPr>
-            <w:tcW w:type="dxa" w:w="3100"/>
+            <w:tcW w:type="dxa" w:w="2600"/>
+            <w:tcMar>
+              <w:top w:type="dxa" w:w="60"/>
+              <w:left w:type="dxa" w:w="90"/>
+              <w:bottom w:type="dxa" w:w="60"/>
+              <w:right w:type="dxa" w:w="90"/>
+            </w:tcMar>
+          </w:tcPr>
+          <w:p>
+            <w:pPr>
+              <w:spacing w:line="240"/>
+              <w:jc w:val="left"/>
+            </w:pPr>
+            <w:r>
+              <w:rPr>
+                <w:rFonts w:ascii="Arial" w:cs="Arial" w:eastAsia="Arial" w:hAnsi="Arial"/>
+                <w:b w:val="false"/>
+                <w:bCs w:val="false"/>
+                <w:i w:val="false"/>
+                <w:iCs w:val="false"/>
+                <w:caps w:val="false"/>
+                <w:sz w:val="20"/>
+                <w:szCs w:val="20"/>
+              </w:rPr>
+              <w:t xml:space="preserve">Agendador do provedor de aplicação</w:t>
+            </w:r>
+          </w:p>
+        </w:tc>
+        <w:tc>
+          <w:tcPr>
+            <w:tcW w:type="dxa" w:w="4000"/>
+            <w:tcMar>
+              <w:top w:type="dxa" w:w="60"/>
+              <w:left w:type="dxa" w:w="90"/>
+              <w:bottom w:type="dxa" w:w="60"/>
+              <w:right w:type="dxa" w:w="90"/>
+            </w:tcMar>
+          </w:tcPr>
+          <w:p>
+            <w:pPr>
+              <w:spacing w:line="240"/>
+              <w:jc w:val="left"/>
+            </w:pPr>
+            <w:r>
+              <w:rPr>
+                <w:rFonts w:ascii="Arial" w:cs="Arial" w:eastAsia="Arial" w:hAnsi="Arial"/>
+                <w:b w:val="false"/>
+                <w:bCs w:val="false"/>
+                <w:i w:val="false"/>
+                <w:iCs w:val="false"/>
+                <w:caps w:val="false"/>
+                <w:sz w:val="20"/>
+                <w:szCs w:val="20"/>
+              </w:rPr>
+              <w:t xml:space="preserve">Execução horária e semanal</w:t>
+            </w:r>
+          </w:p>
+        </w:tc>
+        <w:tc>
+          <w:tcPr>
+            <w:tcW w:type="dxa" w:w="1400"/>
             <w:tcMar>
               <w:top w:type="dxa" w:w="60"/>
               <w:left w:type="dxa" w:w="90"/>
@@ -15567,7 +15548,7 @@
       <w:tr>
         <w:tc>
           <w:tcPr>
-            <w:tcW w:type="dxa" w:w="2300"/>
+            <w:tcW w:type="dxa" w:w="2100"/>
             <w:tcMar>
               <w:top w:type="dxa" w:w="60"/>
               <w:left w:type="dxa" w:w="90"/>
@@ -15597,7 +15578,7 @@
         </w:tc>
         <w:tc>
           <w:tcPr>
-            <w:tcW w:type="dxa" w:w="3200"/>
+            <w:tcW w:type="dxa" w:w="2600"/>
             <w:tcMar>
               <w:top w:type="dxa" w:w="60"/>
               <w:left w:type="dxa" w:w="90"/>
@@ -15627,61 +15608,61 @@
         </w:tc>
         <w:tc>
           <w:tcPr>
-            <w:tcW w:type="dxa" w:w="1500"/>
-            <w:tcMar>
-              <w:top w:type="dxa" w:w="60"/>
-              <w:left w:type="dxa" w:w="90"/>
-              <w:bottom w:type="dxa" w:w="60"/>
-              <w:right w:type="dxa" w:w="90"/>
-            </w:tcMar>
-          </w:tcPr>
-          <w:p>
-            <w:pPr>
-              <w:spacing w:line="240"/>
-              <w:jc w:val="left"/>
-            </w:pPr>
-            <w:r>
-              <w:rPr>
-                <w:rFonts w:ascii="Arial" w:cs="Arial" w:eastAsia="Arial" w:hAnsi="Arial"/>
-                <w:b w:val="false"/>
-                <w:bCs w:val="false"/>
-                <w:i w:val="false"/>
-                <w:iCs w:val="false"/>
-                <w:caps w:val="false"/>
-                <w:sz w:val="20"/>
-                <w:szCs w:val="20"/>
-              </w:rPr>
-              <w:t xml:space="preserve">Armazenamento</w:t>
-            </w:r>
-          </w:p>
-        </w:tc>
-        <w:tc>
-          <w:tcPr>
-            <w:tcW w:type="dxa" w:w="3100"/>
-            <w:tcMar>
-              <w:top w:type="dxa" w:w="60"/>
-              <w:left w:type="dxa" w:w="90"/>
-              <w:bottom w:type="dxa" w:w="60"/>
-              <w:right w:type="dxa" w:w="90"/>
-            </w:tcMar>
-          </w:tcPr>
-          <w:p>
-            <w:pPr>
-              <w:spacing w:line="240"/>
-              <w:jc w:val="left"/>
-            </w:pPr>
-            <w:r>
-              <w:rPr>
-                <w:rFonts w:ascii="Arial" w:cs="Arial" w:eastAsia="Arial" w:hAnsi="Arial"/>
-                <w:b w:val="false"/>
-                <w:bCs w:val="false"/>
-                <w:i w:val="false"/>
-                <w:iCs w:val="false"/>
-                <w:caps w:val="false"/>
-                <w:sz w:val="20"/>
-                <w:szCs w:val="20"/>
-              </w:rPr>
-              <w:t xml:space="preserve">Sem custo no volume utilizado</w:t>
+            <w:tcW w:type="dxa" w:w="4000"/>
+            <w:tcMar>
+              <w:top w:type="dxa" w:w="60"/>
+              <w:left w:type="dxa" w:w="90"/>
+              <w:bottom w:type="dxa" w:w="60"/>
+              <w:right w:type="dxa" w:w="90"/>
+            </w:tcMar>
+          </w:tcPr>
+          <w:p>
+            <w:pPr>
+              <w:spacing w:line="240"/>
+              <w:jc w:val="left"/>
+            </w:pPr>
+            <w:r>
+              <w:rPr>
+                <w:rFonts w:ascii="Arial" w:cs="Arial" w:eastAsia="Arial" w:hAnsi="Arial"/>
+                <w:b w:val="false"/>
+                <w:bCs w:val="false"/>
+                <w:i w:val="false"/>
+                <w:iCs w:val="false"/>
+                <w:caps w:val="false"/>
+                <w:sz w:val="20"/>
+                <w:szCs w:val="20"/>
+              </w:rPr>
+              <w:t xml:space="preserve">1 GB de armazenamento de arquivos</w:t>
+            </w:r>
+          </w:p>
+        </w:tc>
+        <w:tc>
+          <w:tcPr>
+            <w:tcW w:type="dxa" w:w="1400"/>
+            <w:tcMar>
+              <w:top w:type="dxa" w:w="60"/>
+              <w:left w:type="dxa" w:w="90"/>
+              <w:bottom w:type="dxa" w:w="60"/>
+              <w:right w:type="dxa" w:w="90"/>
+            </w:tcMar>
+          </w:tcPr>
+          <w:p>
+            <w:pPr>
+              <w:spacing w:line="240"/>
+              <w:jc w:val="left"/>
+            </w:pPr>
+            <w:r>
+              <w:rPr>
+                <w:rFonts w:ascii="Arial" w:cs="Arial" w:eastAsia="Arial" w:hAnsi="Arial"/>
+                <w:b w:val="false"/>
+                <w:bCs w:val="false"/>
+                <w:i w:val="false"/>
+                <w:iCs w:val="false"/>
+                <w:caps w:val="false"/>
+                <w:sz w:val="20"/>
+                <w:szCs w:val="20"/>
+              </w:rPr>
+              <w:t xml:space="preserve">Sem custo</w:t>
             </w:r>
           </w:p>
         </w:tc>
@@ -15689,7 +15670,7 @@
       <w:tr>
         <w:tc>
           <w:tcPr>
-            <w:tcW w:type="dxa" w:w="2300"/>
+            <w:tcW w:type="dxa" w:w="2100"/>
             <w:tcMar>
               <w:top w:type="dxa" w:w="60"/>
               <w:left w:type="dxa" w:w="90"/>
@@ -15719,7 +15700,7 @@
         </w:tc>
         <w:tc>
           <w:tcPr>
-            <w:tcW w:type="dxa" w:w="3200"/>
+            <w:tcW w:type="dxa" w:w="2600"/>
             <w:tcMar>
               <w:top w:type="dxa" w:w="60"/>
               <w:left w:type="dxa" w:w="90"/>
@@ -15749,37 +15730,37 @@
         </w:tc>
         <w:tc>
           <w:tcPr>
-            <w:tcW w:type="dxa" w:w="1500"/>
-            <w:tcMar>
-              <w:top w:type="dxa" w:w="60"/>
-              <w:left w:type="dxa" w:w="90"/>
-              <w:bottom w:type="dxa" w:w="60"/>
-              <w:right w:type="dxa" w:w="90"/>
-            </w:tcMar>
-          </w:tcPr>
-          <w:p>
-            <w:pPr>
-              <w:spacing w:line="240"/>
-              <w:jc w:val="left"/>
-            </w:pPr>
-            <w:r>
-              <w:rPr>
-                <w:rFonts w:ascii="Arial" w:cs="Arial" w:eastAsia="Arial" w:hAnsi="Arial"/>
-                <w:b w:val="false"/>
-                <w:bCs w:val="false"/>
-                <w:i w:val="false"/>
-                <w:iCs w:val="false"/>
-                <w:caps w:val="false"/>
-                <w:sz w:val="20"/>
-                <w:szCs w:val="20"/>
-              </w:rPr>
-              <w:t xml:space="preserve">PaaS</w:t>
-            </w:r>
-          </w:p>
-        </w:tc>
-        <w:tc>
-          <w:tcPr>
-            <w:tcW w:type="dxa" w:w="3100"/>
+            <w:tcW w:type="dxa" w:w="4000"/>
+            <w:tcMar>
+              <w:top w:type="dxa" w:w="60"/>
+              <w:left w:type="dxa" w:w="90"/>
+              <w:bottom w:type="dxa" w:w="60"/>
+              <w:right w:type="dxa" w:w="90"/>
+            </w:tcMar>
+          </w:tcPr>
+          <w:p>
+            <w:pPr>
+              <w:spacing w:line="240"/>
+              <w:jc w:val="left"/>
+            </w:pPr>
+            <w:r>
+              <w:rPr>
+                <w:rFonts w:ascii="Arial" w:cs="Arial" w:eastAsia="Arial" w:hAnsi="Arial"/>
+                <w:b w:val="false"/>
+                <w:bCs w:val="false"/>
+                <w:i w:val="false"/>
+                <w:iCs w:val="false"/>
+                <w:caps w:val="false"/>
+                <w:sz w:val="20"/>
+                <w:szCs w:val="20"/>
+              </w:rPr>
+              <w:t xml:space="preserve">Camada gratuita para projeto pessoal</w:t>
+            </w:r>
+          </w:p>
+        </w:tc>
+        <w:tc>
+          <w:tcPr>
+            <w:tcW w:type="dxa" w:w="1400"/>
             <w:tcMar>
               <w:top w:type="dxa" w:w="60"/>
               <w:left w:type="dxa" w:w="90"/>
@@ -15830,21 +15811,102 @@
     </w:p>
     <w:p>
       <w:pPr>
-        <w:spacing w:after="240" w:before="240" w:line="360"/>
-        <w:jc w:val="center"/>
-      </w:pPr>
-      <w:r>
-        <w:rPr>
-          <w:rFonts w:ascii="Arial" w:cs="Arial" w:eastAsia="Arial" w:hAnsi="Arial"/>
-          <w:b/>
-          <w:bCs/>
-          <w:i w:val="false"/>
-          <w:iCs w:val="false"/>
-          <w:caps w:val="false"/>
-          <w:sz w:val="24"/>
-          <w:szCs w:val="24"/>
-        </w:rPr>
-        <w:t xml:space="preserve">[A PREENCHER: provedores contratados e limites das camadas gratuitas]</w:t>
+        <w:spacing w:after="0" w:before="0" w:line="360"/>
+        <w:ind w:firstLine="708"/>
+        <w:jc w:val="both"/>
+      </w:pPr>
+      <w:r>
+        <w:rPr>
+          <w:rFonts w:ascii="Arial" w:cs="Arial" w:eastAsia="Arial" w:hAnsi="Arial"/>
+          <w:b w:val="false"/>
+          <w:bCs w:val="false"/>
+          <w:i w:val="false"/>
+          <w:iCs w:val="false"/>
+          <w:caps w:val="false"/>
+          <w:sz w:val="24"/>
+          <w:szCs w:val="24"/>
+        </w:rPr>
+        <w:t xml:space="preserve">A adequação das camadas gratuitas ao volume de dados do projeto foi verificada por dimensionamento prévio, e não por estimativa qualitativa.</w:t>
+      </w:r>
+    </w:p>
+    <w:p>
+      <w:pPr>
+        <w:spacing w:after="0" w:before="0" w:line="360"/>
+        <w:ind w:firstLine="708"/>
+        <w:jc w:val="both"/>
+      </w:pPr>
+      <w:r>
+        <w:rPr>
+          <w:rFonts w:ascii="Arial" w:cs="Arial" w:eastAsia="Arial" w:hAnsi="Arial"/>
+          <w:b w:val="false"/>
+          <w:bCs w:val="false"/>
+          <w:i w:val="false"/>
+          <w:iCs w:val="false"/>
+          <w:caps w:val="false"/>
+          <w:sz w:val="24"/>
+          <w:szCs w:val="24"/>
+        </w:rPr>
+        <w:t xml:space="preserve">Quanto ao tráfego de mensagens, cada publicação transporta aproximadamente 280 bytes, somados o documento JSON e o cabeçalho do protocolo. À taxa de uma leitura a cada cinco segundos, o nó produz 17.280 mensagens diárias, o que corresponde a cerca de 4,8 MB por dia e aproximadamente 145 MB por mês. O limite de 10 GB mensais do broker é, portanto, utilizado em cerca de 1,5% de sua capacidade, o que acomoda folgadamente a inclusão de pontos de medição adicionais.</w:t>
+      </w:r>
+    </w:p>
+    <w:p>
+      <w:pPr>
+        <w:spacing w:after="0" w:before="0" w:line="360"/>
+        <w:ind w:firstLine="708"/>
+        <w:jc w:val="both"/>
+      </w:pPr>
+      <w:r>
+        <w:rPr>
+          <w:rFonts w:ascii="Arial" w:cs="Arial" w:eastAsia="Arial" w:hAnsi="Arial"/>
+          <w:b w:val="false"/>
+          <w:bCs w:val="false"/>
+          <w:i w:val="false"/>
+          <w:iCs w:val="false"/>
+          <w:caps w:val="false"/>
+          <w:sz w:val="24"/>
+          <w:szCs w:val="24"/>
+        </w:rPr>
+        <w:t xml:space="preserve">Quanto ao armazenamento, cada registro da tabela de leituras ocupa aproximadamente 140 bytes, considerados os campos, o cabeçalho da linha e as estruturas de índice associadas. O volume diário resultante é de cerca de 2,4 MB, equivalente a aproximadamente 73 MB mensais. O limite de 500 MB do plano gratuito comporta, nessas condições, cerca de seis meses de coleta contínua, prazo superior ao previsto no cronograma. A tabela de agregados horários é desprezível nesse cálculo, por conter apenas vinte e quatro registros diários.</w:t>
+      </w:r>
+    </w:p>
+    <w:p>
+      <w:pPr>
+        <w:spacing w:after="0" w:before="0" w:line="360"/>
+        <w:ind w:firstLine="708"/>
+        <w:jc w:val="both"/>
+      </w:pPr>
+      <w:r>
+        <w:rPr>
+          <w:rFonts w:ascii="Arial" w:cs="Arial" w:eastAsia="Arial" w:hAnsi="Arial"/>
+          <w:b w:val="false"/>
+          <w:bCs w:val="false"/>
+          <w:i w:val="false"/>
+          <w:iCs w:val="false"/>
+          <w:caps w:val="false"/>
+          <w:sz w:val="24"/>
+          <w:szCs w:val="24"/>
+        </w:rPr>
+        <w:t xml:space="preserve">Duas medidas de contingência foram previstas caso o limite se aproxime: a ampliação do intervalo de amostragem de cinco para quinze segundos, que reduz o volume a um terço sem prejuízo à resolução horária utilizada pelos modelos; e a remoção periódica das leituras brutas anteriores a um horizonte definido, preservando integralmente os agregados horários, que constituem a série efetivamente empregada na previsão.</w:t>
+      </w:r>
+    </w:p>
+    <w:p>
+      <w:pPr>
+        <w:spacing w:after="0" w:before="0" w:line="360"/>
+        <w:ind w:firstLine="708"/>
+        <w:jc w:val="both"/>
+      </w:pPr>
+      <w:r>
+        <w:rPr>
+          <w:rFonts w:ascii="Arial" w:cs="Arial" w:eastAsia="Arial" w:hAnsi="Arial"/>
+          <w:b w:val="false"/>
+          <w:bCs w:val="false"/>
+          <w:i w:val="false"/>
+          <w:iCs w:val="false"/>
+          <w:caps w:val="false"/>
+          <w:sz w:val="24"/>
+          <w:szCs w:val="24"/>
+        </w:rPr>
+        <w:t xml:space="preserve">Registra-se ainda uma condição operacional do plano gratuito de banco de dados: projetos sem atividade por uma semana são suspensos automaticamente. Como o sistema realiza escritas continuamente durante todo o período de coleta, a condição não se aplica em operação normal, mas exige atenção em eventuais interrupções prolongadas.</w:t>
       </w:r>
     </w:p>
     <w:p>
@@ -27090,7 +27152,7 @@
           <w:sz w:val="18"/>
           <w:szCs w:val="18"/>
         </w:rPr>
-        <w:t xml:space="preserve">    df = pd.read_csv(caminho_csv, sep=';', low_memory=False,</w:t>
+        <w:t xml:space="preserve">    df = pd.read_csv(caminho_csv, sep=';', low_memory=False, na_values=['?'])</w:t>
       </w:r>
     </w:p>
     <w:p>
@@ -27104,7 +27166,7 @@
           <w:sz w:val="18"/>
           <w:szCs w:val="18"/>
         </w:rPr>
-        <w:t xml:space="preserve">                     na_values=['?'], parse_dates={'ts': ['Date', 'Time']},</w:t>
+        <w:t xml:space="preserve">    df['ts'] = pd.to_datetime(df['Date'] + ' ' + df['Time'],</w:t>
       </w:r>
     </w:p>
     <w:p>
@@ -27118,7 +27180,7 @@
           <w:sz w:val="18"/>
           <w:szCs w:val="18"/>
         </w:rPr>
-        <w:t xml:space="preserve">                     dayfirst=True)</w:t>
+        <w:t xml:space="preserve">                              format='%d/%m/%Y %H:%M:%S')</w:t>
       </w:r>
     </w:p>
     <w:p>
@@ -28014,7 +28076,7 @@
           <w:sz w:val="18"/>
           <w:szCs w:val="18"/>
         </w:rPr>
-        <w:t xml:space="preserve">    print(pd.DataFrame(resultados).T.round(3))</w:t>
+        <w:t xml:space="preserve">    tab = pd.DataFrame(resultados).T.round(3)</w:t>
       </w:r>
     </w:p>
     <w:p>
@@ -28028,7 +28090,7 @@
           <w:sz w:val="18"/>
           <w:szCs w:val="18"/>
         </w:rPr>
-        <w:t xml:space="preserve">    imp = pd.Series(rf.feature_importances_, index=X.columns)</w:t>
+        <w:t xml:space="preserve">    base_mae = tab.loc['Persistencia sazonal', 'MAE']</w:t>
       </w:r>
     </w:p>
     <w:p>
@@ -28042,7 +28104,7 @@
           <w:sz w:val="18"/>
           <w:szCs w:val="18"/>
         </w:rPr>
-        <w:t xml:space="preserve">    print('\nImportancia dos atributos:')</w:t>
+        <w:t xml:space="preserve">    tab['Reducao MAE (%)'] = ((base_mae - tab['MAE']) / base_mae * 100).round(1)</w:t>
       </w:r>
     </w:p>
     <w:p>
@@ -28056,7 +28118,7 @@
           <w:sz w:val="18"/>
           <w:szCs w:val="18"/>
         </w:rPr>
-        <w:t xml:space="preserve">    print(imp.sort_values(ascending=False).head(10).round(4))</w:t>
+        <w:t xml:space="preserve">    tab.loc['Persistencia sazonal', 'Reducao MAE (%)'] = np.nan</w:t>
       </w:r>
     </w:p>
     <w:p>
@@ -28070,7 +28132,7 @@
           <w:sz w:val="18"/>
           <w:szCs w:val="18"/>
         </w:rPr>
-        <w:t xml:space="preserve">    return resultados, rf, imp</w:t>
+        <w:t xml:space="preserve">    print(tab.to_string())</w:t>
       </w:r>
     </w:p>
     <w:p>
@@ -28084,7 +28146,7 @@
           <w:sz w:val="18"/>
           <w:szCs w:val="18"/>
         </w:rPr>
-        <w:t xml:space="preserve"/>
+        <w:t xml:space="preserve">    imp = pd.Series(rf.feature_importances_, index=X.columns)</w:t>
       </w:r>
     </w:p>
     <w:p>
@@ -28098,7 +28160,7 @@
           <w:sz w:val="18"/>
           <w:szCs w:val="18"/>
         </w:rPr>
-        <w:t xml:space="preserve">if __name__ == '__main__':</w:t>
+        <w:t xml:space="preserve">    print('\nImportancia dos atributos:')</w:t>
       </w:r>
     </w:p>
     <w:p>
@@ -28112,6 +28174,62 @@
           <w:sz w:val="18"/>
           <w:szCs w:val="18"/>
         </w:rPr>
+        <w:t xml:space="preserve">    print(imp.sort_values(ascending=False).head(10).round(4))</w:t>
+      </w:r>
+    </w:p>
+    <w:p>
+      <w:pPr>
+        <w:spacing w:after="0" w:line="240"/>
+        <w:jc w:val="left"/>
+      </w:pPr>
+      <w:r>
+        <w:rPr>
+          <w:rFonts w:ascii="Courier New" w:cs="Courier New" w:eastAsia="Courier New" w:hAnsi="Courier New"/>
+          <w:sz w:val="18"/>
+          <w:szCs w:val="18"/>
+        </w:rPr>
+        <w:t xml:space="preserve">    return resultados, rf, imp</w:t>
+      </w:r>
+    </w:p>
+    <w:p>
+      <w:pPr>
+        <w:spacing w:after="0" w:line="240"/>
+        <w:jc w:val="left"/>
+      </w:pPr>
+      <w:r>
+        <w:rPr>
+          <w:rFonts w:ascii="Courier New" w:cs="Courier New" w:eastAsia="Courier New" w:hAnsi="Courier New"/>
+          <w:sz w:val="18"/>
+          <w:szCs w:val="18"/>
+        </w:rPr>
+        <w:t xml:space="preserve"/>
+      </w:r>
+    </w:p>
+    <w:p>
+      <w:pPr>
+        <w:spacing w:after="0" w:line="240"/>
+        <w:jc w:val="left"/>
+      </w:pPr>
+      <w:r>
+        <w:rPr>
+          <w:rFonts w:ascii="Courier New" w:cs="Courier New" w:eastAsia="Courier New" w:hAnsi="Courier New"/>
+          <w:sz w:val="18"/>
+          <w:szCs w:val="18"/>
+        </w:rPr>
+        <w:t xml:space="preserve">if __name__ == '__main__':</w:t>
+      </w:r>
+    </w:p>
+    <w:p>
+      <w:pPr>
+        <w:spacing w:after="0" w:line="240"/>
+        <w:jc w:val="left"/>
+      </w:pPr>
+      <w:r>
+        <w:rPr>
+          <w:rFonts w:ascii="Courier New" w:cs="Courier New" w:eastAsia="Courier New" w:hAnsi="Courier New"/>
+          <w:sz w:val="18"/>
+          <w:szCs w:val="18"/>
+        </w:rPr>
         <w:t xml:space="preserve">    executar('household_power_consumption.txt')</w:t>
       </w:r>
     </w:p>
@@ -28869,7 +28987,7 @@
     </w:p>
     <w:tbl>
       <w:tblPr>
-        <w:tblW w:type="dxa" w:w="9700"/>
+        <w:tblW w:type="dxa" w:w="9300"/>
         <w:tblBorders>
           <w:top w:val="single" w:color="auto" w:sz="4"/>
           <w:left w:val="single" w:color="auto" w:sz="4"/>
@@ -28881,10 +28999,10 @@
       </w:tblPr>
       <w:tblGrid>
         <w:gridCol w:w="2200"/>
-        <w:gridCol w:w="3000"/>
-        <w:gridCol w:w="700"/>
-        <w:gridCol w:w="1900"/>
-        <w:gridCol w:w="1900"/>
+        <w:gridCol w:w="3200"/>
+        <w:gridCol w:w="600"/>
+        <w:gridCol w:w="1800"/>
+        <w:gridCol w:w="1500"/>
       </w:tblGrid>
       <w:tr>
         <w:trPr>
@@ -28923,7 +29041,7 @@
         </w:tc>
         <w:tc>
           <w:tcPr>
-            <w:tcW w:type="dxa" w:w="3000"/>
+            <w:tcW w:type="dxa" w:w="3200"/>
             <w:shd w:fill="D9D9D9" w:color="auto" w:val="clear"/>
             <w:tcMar>
               <w:top w:type="dxa" w:w="60"/>
@@ -28954,7 +29072,7 @@
         </w:tc>
         <w:tc>
           <w:tcPr>
-            <w:tcW w:type="dxa" w:w="700"/>
+            <w:tcW w:type="dxa" w:w="600"/>
             <w:shd w:fill="D9D9D9" w:color="auto" w:val="clear"/>
             <w:tcMar>
               <w:top w:type="dxa" w:w="60"/>
@@ -28985,7 +29103,7 @@
         </w:tc>
         <w:tc>
           <w:tcPr>
-            <w:tcW w:type="dxa" w:w="1900"/>
+            <w:tcW w:type="dxa" w:w="1800"/>
             <w:shd w:fill="D9D9D9" w:color="auto" w:val="clear"/>
             <w:tcMar>
               <w:top w:type="dxa" w:w="60"/>
@@ -29010,13 +29128,13 @@
                 <w:sz w:val="20"/>
                 <w:szCs w:val="20"/>
               </w:rPr>
-              <w:t xml:space="preserve">Valor unitário</w:t>
-            </w:r>
-          </w:p>
-        </w:tc>
-        <w:tc>
-          <w:tcPr>
-            <w:tcW w:type="dxa" w:w="1900"/>
+              <w:t xml:space="preserve">Valor unitário (R$)</w:t>
+            </w:r>
+          </w:p>
+        </w:tc>
+        <w:tc>
+          <w:tcPr>
+            <w:tcW w:type="dxa" w:w="1500"/>
             <w:shd w:fill="D9D9D9" w:color="auto" w:val="clear"/>
             <w:tcMar>
               <w:top w:type="dxa" w:w="60"/>
@@ -29041,7 +29159,7 @@
                 <w:sz w:val="20"/>
                 <w:szCs w:val="20"/>
               </w:rPr>
-              <w:t xml:space="preserve">Valor total</w:t>
+              <w:t xml:space="preserve">Valor total (R$)</w:t>
             </w:r>
           </w:p>
         </w:tc>
@@ -29079,37 +29197,37 @@
         </w:tc>
         <w:tc>
           <w:tcPr>
-            <w:tcW w:type="dxa" w:w="3000"/>
-            <w:tcMar>
-              <w:top w:type="dxa" w:w="60"/>
-              <w:left w:type="dxa" w:w="90"/>
-              <w:bottom w:type="dxa" w:w="60"/>
-              <w:right w:type="dxa" w:w="90"/>
-            </w:tcMar>
-          </w:tcPr>
-          <w:p>
-            <w:pPr>
-              <w:spacing w:line="240"/>
-              <w:jc w:val="left"/>
-            </w:pPr>
-            <w:r>
-              <w:rPr>
-                <w:rFonts w:ascii="Arial" w:cs="Arial" w:eastAsia="Arial" w:hAnsi="Arial"/>
-                <w:b w:val="false"/>
-                <w:bCs w:val="false"/>
-                <w:i w:val="false"/>
-                <w:iCs w:val="false"/>
-                <w:caps w:val="false"/>
-                <w:sz w:val="20"/>
-                <w:szCs w:val="20"/>
-              </w:rPr>
-              <w:t xml:space="preserve">ESP32 DevKit V1 (38 pinos)</w:t>
-            </w:r>
-          </w:p>
-        </w:tc>
-        <w:tc>
-          <w:tcPr>
-            <w:tcW w:type="dxa" w:w="700"/>
+            <w:tcW w:type="dxa" w:w="3200"/>
+            <w:tcMar>
+              <w:top w:type="dxa" w:w="60"/>
+              <w:left w:type="dxa" w:w="90"/>
+              <w:bottom w:type="dxa" w:w="60"/>
+              <w:right w:type="dxa" w:w="90"/>
+            </w:tcMar>
+          </w:tcPr>
+          <w:p>
+            <w:pPr>
+              <w:spacing w:line="240"/>
+              <w:jc w:val="left"/>
+            </w:pPr>
+            <w:r>
+              <w:rPr>
+                <w:rFonts w:ascii="Arial" w:cs="Arial" w:eastAsia="Arial" w:hAnsi="Arial"/>
+                <w:b w:val="false"/>
+                <w:bCs w:val="false"/>
+                <w:i w:val="false"/>
+                <w:iCs w:val="false"/>
+                <w:caps w:val="false"/>
+                <w:sz w:val="20"/>
+                <w:szCs w:val="20"/>
+              </w:rPr>
+              <w:t xml:space="preserve">ESP32 DevKit WROOM-32, 38 pinos, USB-C</w:t>
+            </w:r>
+          </w:p>
+        </w:tc>
+        <w:tc>
+          <w:tcPr>
+            <w:tcW w:type="dxa" w:w="600"/>
             <w:tcMar>
               <w:top w:type="dxa" w:w="60"/>
               <w:left w:type="dxa" w:w="90"/>
@@ -29139,61 +29257,61 @@
         </w:tc>
         <w:tc>
           <w:tcPr>
-            <w:tcW w:type="dxa" w:w="1900"/>
-            <w:tcMar>
-              <w:top w:type="dxa" w:w="60"/>
-              <w:left w:type="dxa" w:w="90"/>
-              <w:bottom w:type="dxa" w:w="60"/>
-              <w:right w:type="dxa" w:w="90"/>
-            </w:tcMar>
-          </w:tcPr>
-          <w:p>
-            <w:pPr>
-              <w:spacing w:line="240"/>
-              <w:jc w:val="left"/>
-            </w:pPr>
-            <w:r>
-              <w:rPr>
-                <w:rFonts w:ascii="Arial" w:cs="Arial" w:eastAsia="Arial" w:hAnsi="Arial"/>
-                <w:b w:val="false"/>
-                <w:bCs w:val="false"/>
-                <w:i w:val="false"/>
-                <w:iCs w:val="false"/>
-                <w:caps w:val="false"/>
-                <w:sz w:val="20"/>
-                <w:szCs w:val="20"/>
-              </w:rPr>
-              <w:t xml:space="preserve">A preencher</w:t>
-            </w:r>
-          </w:p>
-        </w:tc>
-        <w:tc>
-          <w:tcPr>
-            <w:tcW w:type="dxa" w:w="1900"/>
-            <w:tcMar>
-              <w:top w:type="dxa" w:w="60"/>
-              <w:left w:type="dxa" w:w="90"/>
-              <w:bottom w:type="dxa" w:w="60"/>
-              <w:right w:type="dxa" w:w="90"/>
-            </w:tcMar>
-          </w:tcPr>
-          <w:p>
-            <w:pPr>
-              <w:spacing w:line="240"/>
-              <w:jc w:val="left"/>
-            </w:pPr>
-            <w:r>
-              <w:rPr>
-                <w:rFonts w:ascii="Arial" w:cs="Arial" w:eastAsia="Arial" w:hAnsi="Arial"/>
-                <w:b w:val="false"/>
-                <w:bCs w:val="false"/>
-                <w:i w:val="false"/>
-                <w:iCs w:val="false"/>
-                <w:caps w:val="false"/>
-                <w:sz w:val="20"/>
-                <w:szCs w:val="20"/>
-              </w:rPr>
-              <w:t xml:space="preserve">A preencher</w:t>
+            <w:tcW w:type="dxa" w:w="1800"/>
+            <w:tcMar>
+              <w:top w:type="dxa" w:w="60"/>
+              <w:left w:type="dxa" w:w="90"/>
+              <w:bottom w:type="dxa" w:w="60"/>
+              <w:right w:type="dxa" w:w="90"/>
+            </w:tcMar>
+          </w:tcPr>
+          <w:p>
+            <w:pPr>
+              <w:spacing w:line="240"/>
+              <w:jc w:val="left"/>
+            </w:pPr>
+            <w:r>
+              <w:rPr>
+                <w:rFonts w:ascii="Arial" w:cs="Arial" w:eastAsia="Arial" w:hAnsi="Arial"/>
+                <w:b w:val="false"/>
+                <w:bCs w:val="false"/>
+                <w:i w:val="false"/>
+                <w:iCs w:val="false"/>
+                <w:caps w:val="false"/>
+                <w:sz w:val="20"/>
+                <w:szCs w:val="20"/>
+              </w:rPr>
+              <w:t xml:space="preserve">67,94</w:t>
+            </w:r>
+          </w:p>
+        </w:tc>
+        <w:tc>
+          <w:tcPr>
+            <w:tcW w:type="dxa" w:w="1500"/>
+            <w:tcMar>
+              <w:top w:type="dxa" w:w="60"/>
+              <w:left w:type="dxa" w:w="90"/>
+              <w:bottom w:type="dxa" w:w="60"/>
+              <w:right w:type="dxa" w:w="90"/>
+            </w:tcMar>
+          </w:tcPr>
+          <w:p>
+            <w:pPr>
+              <w:spacing w:line="240"/>
+              <w:jc w:val="left"/>
+            </w:pPr>
+            <w:r>
+              <w:rPr>
+                <w:rFonts w:ascii="Arial" w:cs="Arial" w:eastAsia="Arial" w:hAnsi="Arial"/>
+                <w:b w:val="false"/>
+                <w:bCs w:val="false"/>
+                <w:i w:val="false"/>
+                <w:iCs w:val="false"/>
+                <w:caps w:val="false"/>
+                <w:sz w:val="20"/>
+                <w:szCs w:val="20"/>
+              </w:rPr>
+              <w:t xml:space="preserve">67,94</w:t>
             </w:r>
           </w:p>
         </w:tc>
@@ -29231,37 +29349,37 @@
         </w:tc>
         <w:tc>
           <w:tcPr>
-            <w:tcW w:type="dxa" w:w="3000"/>
-            <w:tcMar>
-              <w:top w:type="dxa" w:w="60"/>
-              <w:left w:type="dxa" w:w="90"/>
-              <w:bottom w:type="dxa" w:w="60"/>
-              <w:right w:type="dxa" w:w="90"/>
-            </w:tcMar>
-          </w:tcPr>
-          <w:p>
-            <w:pPr>
-              <w:spacing w:line="240"/>
-              <w:jc w:val="left"/>
-            </w:pPr>
-            <w:r>
-              <w:rPr>
-                <w:rFonts w:ascii="Arial" w:cs="Arial" w:eastAsia="Arial" w:hAnsi="Arial"/>
-                <w:b w:val="false"/>
-                <w:bCs w:val="false"/>
-                <w:i w:val="false"/>
-                <w:iCs w:val="false"/>
-                <w:caps w:val="false"/>
-                <w:sz w:val="20"/>
-                <w:szCs w:val="20"/>
-              </w:rPr>
-              <w:t xml:space="preserve">SCT-013-030 (transformador de núcleo bipartido, 30 A)</w:t>
-            </w:r>
-          </w:p>
-        </w:tc>
-        <w:tc>
-          <w:tcPr>
-            <w:tcW w:type="dxa" w:w="700"/>
+            <w:tcW w:type="dxa" w:w="3200"/>
+            <w:tcMar>
+              <w:top w:type="dxa" w:w="60"/>
+              <w:left w:type="dxa" w:w="90"/>
+              <w:bottom w:type="dxa" w:w="60"/>
+              <w:right w:type="dxa" w:w="90"/>
+            </w:tcMar>
+          </w:tcPr>
+          <w:p>
+            <w:pPr>
+              <w:spacing w:line="240"/>
+              <w:jc w:val="left"/>
+            </w:pPr>
+            <w:r>
+              <w:rPr>
+                <w:rFonts w:ascii="Arial" w:cs="Arial" w:eastAsia="Arial" w:hAnsi="Arial"/>
+                <w:b w:val="false"/>
+                <w:bCs w:val="false"/>
+                <w:i w:val="false"/>
+                <w:iCs w:val="false"/>
+                <w:caps w:val="false"/>
+                <w:sz w:val="20"/>
+                <w:szCs w:val="20"/>
+              </w:rPr>
+              <w:t xml:space="preserve">SCT-013-030, transformador de núcleo bipartido, 30 A / 1 V</w:t>
+            </w:r>
+          </w:p>
+        </w:tc>
+        <w:tc>
+          <w:tcPr>
+            <w:tcW w:type="dxa" w:w="600"/>
             <w:tcMar>
               <w:top w:type="dxa" w:w="60"/>
               <w:left w:type="dxa" w:w="90"/>
@@ -29291,61 +29409,61 @@
         </w:tc>
         <w:tc>
           <w:tcPr>
-            <w:tcW w:type="dxa" w:w="1900"/>
-            <w:tcMar>
-              <w:top w:type="dxa" w:w="60"/>
-              <w:left w:type="dxa" w:w="90"/>
-              <w:bottom w:type="dxa" w:w="60"/>
-              <w:right w:type="dxa" w:w="90"/>
-            </w:tcMar>
-          </w:tcPr>
-          <w:p>
-            <w:pPr>
-              <w:spacing w:line="240"/>
-              <w:jc w:val="left"/>
-            </w:pPr>
-            <w:r>
-              <w:rPr>
-                <w:rFonts w:ascii="Arial" w:cs="Arial" w:eastAsia="Arial" w:hAnsi="Arial"/>
-                <w:b w:val="false"/>
-                <w:bCs w:val="false"/>
-                <w:i w:val="false"/>
-                <w:iCs w:val="false"/>
-                <w:caps w:val="false"/>
-                <w:sz w:val="20"/>
-                <w:szCs w:val="20"/>
-              </w:rPr>
-              <w:t xml:space="preserve">A preencher</w:t>
-            </w:r>
-          </w:p>
-        </w:tc>
-        <w:tc>
-          <w:tcPr>
-            <w:tcW w:type="dxa" w:w="1900"/>
-            <w:tcMar>
-              <w:top w:type="dxa" w:w="60"/>
-              <w:left w:type="dxa" w:w="90"/>
-              <w:bottom w:type="dxa" w:w="60"/>
-              <w:right w:type="dxa" w:w="90"/>
-            </w:tcMar>
-          </w:tcPr>
-          <w:p>
-            <w:pPr>
-              <w:spacing w:line="240"/>
-              <w:jc w:val="left"/>
-            </w:pPr>
-            <w:r>
-              <w:rPr>
-                <w:rFonts w:ascii="Arial" w:cs="Arial" w:eastAsia="Arial" w:hAnsi="Arial"/>
-                <w:b w:val="false"/>
-                <w:bCs w:val="false"/>
-                <w:i w:val="false"/>
-                <w:iCs w:val="false"/>
-                <w:caps w:val="false"/>
-                <w:sz w:val="20"/>
-                <w:szCs w:val="20"/>
-              </w:rPr>
-              <w:t xml:space="preserve">A preencher</w:t>
+            <w:tcW w:type="dxa" w:w="1800"/>
+            <w:tcMar>
+              <w:top w:type="dxa" w:w="60"/>
+              <w:left w:type="dxa" w:w="90"/>
+              <w:bottom w:type="dxa" w:w="60"/>
+              <w:right w:type="dxa" w:w="90"/>
+            </w:tcMar>
+          </w:tcPr>
+          <w:p>
+            <w:pPr>
+              <w:spacing w:line="240"/>
+              <w:jc w:val="left"/>
+            </w:pPr>
+            <w:r>
+              <w:rPr>
+                <w:rFonts w:ascii="Arial" w:cs="Arial" w:eastAsia="Arial" w:hAnsi="Arial"/>
+                <w:b w:val="false"/>
+                <w:bCs w:val="false"/>
+                <w:i w:val="false"/>
+                <w:iCs w:val="false"/>
+                <w:caps w:val="false"/>
+                <w:sz w:val="20"/>
+                <w:szCs w:val="20"/>
+              </w:rPr>
+              <w:t xml:space="preserve">59,90</w:t>
+            </w:r>
+          </w:p>
+        </w:tc>
+        <w:tc>
+          <w:tcPr>
+            <w:tcW w:type="dxa" w:w="1500"/>
+            <w:tcMar>
+              <w:top w:type="dxa" w:w="60"/>
+              <w:left w:type="dxa" w:w="90"/>
+              <w:bottom w:type="dxa" w:w="60"/>
+              <w:right w:type="dxa" w:w="90"/>
+            </w:tcMar>
+          </w:tcPr>
+          <w:p>
+            <w:pPr>
+              <w:spacing w:line="240"/>
+              <w:jc w:val="left"/>
+            </w:pPr>
+            <w:r>
+              <w:rPr>
+                <w:rFonts w:ascii="Arial" w:cs="Arial" w:eastAsia="Arial" w:hAnsi="Arial"/>
+                <w:b w:val="false"/>
+                <w:bCs w:val="false"/>
+                <w:i w:val="false"/>
+                <w:iCs w:val="false"/>
+                <w:caps w:val="false"/>
+                <w:sz w:val="20"/>
+                <w:szCs w:val="20"/>
+              </w:rPr>
+              <w:t xml:space="preserve">59,90</w:t>
             </w:r>
           </w:p>
         </w:tc>
@@ -29377,43 +29495,43 @@
                 <w:sz w:val="20"/>
                 <w:szCs w:val="20"/>
               </w:rPr>
-              <w:t xml:space="preserve">Conector do sensor</w:t>
-            </w:r>
-          </w:p>
-        </w:tc>
-        <w:tc>
-          <w:tcPr>
-            <w:tcW w:type="dxa" w:w="3000"/>
-            <w:tcMar>
-              <w:top w:type="dxa" w:w="60"/>
-              <w:left w:type="dxa" w:w="90"/>
-              <w:bottom w:type="dxa" w:w="60"/>
-              <w:right w:type="dxa" w:w="90"/>
-            </w:tcMar>
-          </w:tcPr>
-          <w:p>
-            <w:pPr>
-              <w:spacing w:line="240"/>
-              <w:jc w:val="left"/>
-            </w:pPr>
-            <w:r>
-              <w:rPr>
-                <w:rFonts w:ascii="Arial" w:cs="Arial" w:eastAsia="Arial" w:hAnsi="Arial"/>
-                <w:b w:val="false"/>
-                <w:bCs w:val="false"/>
-                <w:i w:val="false"/>
-                <w:iCs w:val="false"/>
-                <w:caps w:val="false"/>
-                <w:sz w:val="20"/>
-                <w:szCs w:val="20"/>
-              </w:rPr>
-              <w:t xml:space="preserve">Jack P2 fêmea 3,5 mm</w:t>
-            </w:r>
-          </w:p>
-        </w:tc>
-        <w:tc>
-          <w:tcPr>
-            <w:tcW w:type="dxa" w:w="700"/>
+              <w:t xml:space="preserve">Placa de prototipagem</w:t>
+            </w:r>
+          </w:p>
+        </w:tc>
+        <w:tc>
+          <w:tcPr>
+            <w:tcW w:type="dxa" w:w="3200"/>
+            <w:tcMar>
+              <w:top w:type="dxa" w:w="60"/>
+              <w:left w:type="dxa" w:w="90"/>
+              <w:bottom w:type="dxa" w:w="60"/>
+              <w:right w:type="dxa" w:w="90"/>
+            </w:tcMar>
+          </w:tcPr>
+          <w:p>
+            <w:pPr>
+              <w:spacing w:line="240"/>
+              <w:jc w:val="left"/>
+            </w:pPr>
+            <w:r>
+              <w:rPr>
+                <w:rFonts w:ascii="Arial" w:cs="Arial" w:eastAsia="Arial" w:hAnsi="Arial"/>
+                <w:b w:val="false"/>
+                <w:bCs w:val="false"/>
+                <w:i w:val="false"/>
+                <w:iCs w:val="false"/>
+                <w:caps w:val="false"/>
+                <w:sz w:val="20"/>
+                <w:szCs w:val="20"/>
+              </w:rPr>
+              <w:t xml:space="preserve">Protoboard MB-102, 830 pontos</w:t>
+            </w:r>
+          </w:p>
+        </w:tc>
+        <w:tc>
+          <w:tcPr>
+            <w:tcW w:type="dxa" w:w="600"/>
             <w:tcMar>
               <w:top w:type="dxa" w:w="60"/>
               <w:left w:type="dxa" w:w="90"/>
@@ -29443,61 +29561,61 @@
         </w:tc>
         <w:tc>
           <w:tcPr>
-            <w:tcW w:type="dxa" w:w="1900"/>
-            <w:tcMar>
-              <w:top w:type="dxa" w:w="60"/>
-              <w:left w:type="dxa" w:w="90"/>
-              <w:bottom w:type="dxa" w:w="60"/>
-              <w:right w:type="dxa" w:w="90"/>
-            </w:tcMar>
-          </w:tcPr>
-          <w:p>
-            <w:pPr>
-              <w:spacing w:line="240"/>
-              <w:jc w:val="left"/>
-            </w:pPr>
-            <w:r>
-              <w:rPr>
-                <w:rFonts w:ascii="Arial" w:cs="Arial" w:eastAsia="Arial" w:hAnsi="Arial"/>
-                <w:b w:val="false"/>
-                <w:bCs w:val="false"/>
-                <w:i w:val="false"/>
-                <w:iCs w:val="false"/>
-                <w:caps w:val="false"/>
-                <w:sz w:val="20"/>
-                <w:szCs w:val="20"/>
-              </w:rPr>
-              <w:t xml:space="preserve">A preencher</w:t>
-            </w:r>
-          </w:p>
-        </w:tc>
-        <w:tc>
-          <w:tcPr>
-            <w:tcW w:type="dxa" w:w="1900"/>
-            <w:tcMar>
-              <w:top w:type="dxa" w:w="60"/>
-              <w:left w:type="dxa" w:w="90"/>
-              <w:bottom w:type="dxa" w:w="60"/>
-              <w:right w:type="dxa" w:w="90"/>
-            </w:tcMar>
-          </w:tcPr>
-          <w:p>
-            <w:pPr>
-              <w:spacing w:line="240"/>
-              <w:jc w:val="left"/>
-            </w:pPr>
-            <w:r>
-              <w:rPr>
-                <w:rFonts w:ascii="Arial" w:cs="Arial" w:eastAsia="Arial" w:hAnsi="Arial"/>
-                <w:b w:val="false"/>
-                <w:bCs w:val="false"/>
-                <w:i w:val="false"/>
-                <w:iCs w:val="false"/>
-                <w:caps w:val="false"/>
-                <w:sz w:val="20"/>
-                <w:szCs w:val="20"/>
-              </w:rPr>
-              <w:t xml:space="preserve">A preencher</w:t>
+            <w:tcW w:type="dxa" w:w="1800"/>
+            <w:tcMar>
+              <w:top w:type="dxa" w:w="60"/>
+              <w:left w:type="dxa" w:w="90"/>
+              <w:bottom w:type="dxa" w:w="60"/>
+              <w:right w:type="dxa" w:w="90"/>
+            </w:tcMar>
+          </w:tcPr>
+          <w:p>
+            <w:pPr>
+              <w:spacing w:line="240"/>
+              <w:jc w:val="left"/>
+            </w:pPr>
+            <w:r>
+              <w:rPr>
+                <w:rFonts w:ascii="Arial" w:cs="Arial" w:eastAsia="Arial" w:hAnsi="Arial"/>
+                <w:b w:val="false"/>
+                <w:bCs w:val="false"/>
+                <w:i w:val="false"/>
+                <w:iCs w:val="false"/>
+                <w:caps w:val="false"/>
+                <w:sz w:val="20"/>
+                <w:szCs w:val="20"/>
+              </w:rPr>
+              <w:t xml:space="preserve">19,00</w:t>
+            </w:r>
+          </w:p>
+        </w:tc>
+        <w:tc>
+          <w:tcPr>
+            <w:tcW w:type="dxa" w:w="1500"/>
+            <w:tcMar>
+              <w:top w:type="dxa" w:w="60"/>
+              <w:left w:type="dxa" w:w="90"/>
+              <w:bottom w:type="dxa" w:w="60"/>
+              <w:right w:type="dxa" w:w="90"/>
+            </w:tcMar>
+          </w:tcPr>
+          <w:p>
+            <w:pPr>
+              <w:spacing w:line="240"/>
+              <w:jc w:val="left"/>
+            </w:pPr>
+            <w:r>
+              <w:rPr>
+                <w:rFonts w:ascii="Arial" w:cs="Arial" w:eastAsia="Arial" w:hAnsi="Arial"/>
+                <w:b w:val="false"/>
+                <w:bCs w:val="false"/>
+                <w:i w:val="false"/>
+                <w:iCs w:val="false"/>
+                <w:caps w:val="false"/>
+                <w:sz w:val="20"/>
+                <w:szCs w:val="20"/>
+              </w:rPr>
+              <w:t xml:space="preserve">19,00</w:t>
             </w:r>
           </w:p>
         </w:tc>
@@ -29529,127 +29647,127 @@
                 <w:sz w:val="20"/>
                 <w:szCs w:val="20"/>
               </w:rPr>
-              <w:t xml:space="preserve">Condicionamento de sinal</w:t>
-            </w:r>
-          </w:p>
-        </w:tc>
-        <w:tc>
-          <w:tcPr>
-            <w:tcW w:type="dxa" w:w="3000"/>
-            <w:tcMar>
-              <w:top w:type="dxa" w:w="60"/>
-              <w:left w:type="dxa" w:w="90"/>
-              <w:bottom w:type="dxa" w:w="60"/>
-              <w:right w:type="dxa" w:w="90"/>
-            </w:tcMar>
-          </w:tcPr>
-          <w:p>
-            <w:pPr>
-              <w:spacing w:line="240"/>
-              <w:jc w:val="left"/>
-            </w:pPr>
-            <w:r>
-              <w:rPr>
-                <w:rFonts w:ascii="Arial" w:cs="Arial" w:eastAsia="Arial" w:hAnsi="Arial"/>
-                <w:b w:val="false"/>
-                <w:bCs w:val="false"/>
-                <w:i w:val="false"/>
-                <w:iCs w:val="false"/>
-                <w:caps w:val="false"/>
-                <w:sz w:val="20"/>
-                <w:szCs w:val="20"/>
-              </w:rPr>
-              <w:t xml:space="preserve">Resistores de 10 kΩ (2 un.) e capacitor de 10 µF</w:t>
-            </w:r>
-          </w:p>
-        </w:tc>
-        <w:tc>
-          <w:tcPr>
-            <w:tcW w:type="dxa" w:w="700"/>
-            <w:tcMar>
-              <w:top w:type="dxa" w:w="60"/>
-              <w:left w:type="dxa" w:w="90"/>
-              <w:bottom w:type="dxa" w:w="60"/>
-              <w:right w:type="dxa" w:w="90"/>
-            </w:tcMar>
-          </w:tcPr>
-          <w:p>
-            <w:pPr>
-              <w:spacing w:line="240"/>
-              <w:jc w:val="left"/>
-            </w:pPr>
-            <w:r>
-              <w:rPr>
-                <w:rFonts w:ascii="Arial" w:cs="Arial" w:eastAsia="Arial" w:hAnsi="Arial"/>
-                <w:b w:val="false"/>
-                <w:bCs w:val="false"/>
-                <w:i w:val="false"/>
-                <w:iCs w:val="false"/>
-                <w:caps w:val="false"/>
-                <w:sz w:val="20"/>
-                <w:szCs w:val="20"/>
-              </w:rPr>
-              <w:t xml:space="preserve">1</w:t>
-            </w:r>
-          </w:p>
-        </w:tc>
-        <w:tc>
-          <w:tcPr>
-            <w:tcW w:type="dxa" w:w="1900"/>
-            <w:tcMar>
-              <w:top w:type="dxa" w:w="60"/>
-              <w:left w:type="dxa" w:w="90"/>
-              <w:bottom w:type="dxa" w:w="60"/>
-              <w:right w:type="dxa" w:w="90"/>
-            </w:tcMar>
-          </w:tcPr>
-          <w:p>
-            <w:pPr>
-              <w:spacing w:line="240"/>
-              <w:jc w:val="left"/>
-            </w:pPr>
-            <w:r>
-              <w:rPr>
-                <w:rFonts w:ascii="Arial" w:cs="Arial" w:eastAsia="Arial" w:hAnsi="Arial"/>
-                <w:b w:val="false"/>
-                <w:bCs w:val="false"/>
-                <w:i w:val="false"/>
-                <w:iCs w:val="false"/>
-                <w:caps w:val="false"/>
-                <w:sz w:val="20"/>
-                <w:szCs w:val="20"/>
-              </w:rPr>
-              <w:t xml:space="preserve">A preencher</w:t>
-            </w:r>
-          </w:p>
-        </w:tc>
-        <w:tc>
-          <w:tcPr>
-            <w:tcW w:type="dxa" w:w="1900"/>
-            <w:tcMar>
-              <w:top w:type="dxa" w:w="60"/>
-              <w:left w:type="dxa" w:w="90"/>
-              <w:bottom w:type="dxa" w:w="60"/>
-              <w:right w:type="dxa" w:w="90"/>
-            </w:tcMar>
-          </w:tcPr>
-          <w:p>
-            <w:pPr>
-              <w:spacing w:line="240"/>
-              <w:jc w:val="left"/>
-            </w:pPr>
-            <w:r>
-              <w:rPr>
-                <w:rFonts w:ascii="Arial" w:cs="Arial" w:eastAsia="Arial" w:hAnsi="Arial"/>
-                <w:b w:val="false"/>
-                <w:bCs w:val="false"/>
-                <w:i w:val="false"/>
-                <w:iCs w:val="false"/>
-                <w:caps w:val="false"/>
-                <w:sz w:val="20"/>
-                <w:szCs w:val="20"/>
-              </w:rPr>
-              <w:t xml:space="preserve">A preencher</w:t>
+              <w:t xml:space="preserve">Cabos de ligação</w:t>
+            </w:r>
+          </w:p>
+        </w:tc>
+        <w:tc>
+          <w:tcPr>
+            <w:tcW w:type="dxa" w:w="3200"/>
+            <w:tcMar>
+              <w:top w:type="dxa" w:w="60"/>
+              <w:left w:type="dxa" w:w="90"/>
+              <w:bottom w:type="dxa" w:w="60"/>
+              <w:right w:type="dxa" w:w="90"/>
+            </w:tcMar>
+          </w:tcPr>
+          <w:p>
+            <w:pPr>
+              <w:spacing w:line="240"/>
+              <w:jc w:val="left"/>
+            </w:pPr>
+            <w:r>
+              <w:rPr>
+                <w:rFonts w:ascii="Arial" w:cs="Arial" w:eastAsia="Arial" w:hAnsi="Arial"/>
+                <w:b w:val="false"/>
+                <w:bCs w:val="false"/>
+                <w:i w:val="false"/>
+                <w:iCs w:val="false"/>
+                <w:caps w:val="false"/>
+                <w:sz w:val="20"/>
+                <w:szCs w:val="20"/>
+              </w:rPr>
+              <w:t xml:space="preserve">Kit de 60 jumpers de 20 cm (6 utilizados)</w:t>
+            </w:r>
+          </w:p>
+        </w:tc>
+        <w:tc>
+          <w:tcPr>
+            <w:tcW w:type="dxa" w:w="600"/>
+            <w:tcMar>
+              <w:top w:type="dxa" w:w="60"/>
+              <w:left w:type="dxa" w:w="90"/>
+              <w:bottom w:type="dxa" w:w="60"/>
+              <w:right w:type="dxa" w:w="90"/>
+            </w:tcMar>
+          </w:tcPr>
+          <w:p>
+            <w:pPr>
+              <w:spacing w:line="240"/>
+              <w:jc w:val="left"/>
+            </w:pPr>
+            <w:r>
+              <w:rPr>
+                <w:rFonts w:ascii="Arial" w:cs="Arial" w:eastAsia="Arial" w:hAnsi="Arial"/>
+                <w:b w:val="false"/>
+                <w:bCs w:val="false"/>
+                <w:i w:val="false"/>
+                <w:iCs w:val="false"/>
+                <w:caps w:val="false"/>
+                <w:sz w:val="20"/>
+                <w:szCs w:val="20"/>
+              </w:rPr>
+              <w:t xml:space="preserve">6</w:t>
+            </w:r>
+          </w:p>
+        </w:tc>
+        <w:tc>
+          <w:tcPr>
+            <w:tcW w:type="dxa" w:w="1800"/>
+            <w:tcMar>
+              <w:top w:type="dxa" w:w="60"/>
+              <w:left w:type="dxa" w:w="90"/>
+              <w:bottom w:type="dxa" w:w="60"/>
+              <w:right w:type="dxa" w:w="90"/>
+            </w:tcMar>
+          </w:tcPr>
+          <w:p>
+            <w:pPr>
+              <w:spacing w:line="240"/>
+              <w:jc w:val="left"/>
+            </w:pPr>
+            <w:r>
+              <w:rPr>
+                <w:rFonts w:ascii="Arial" w:cs="Arial" w:eastAsia="Arial" w:hAnsi="Arial"/>
+                <w:b w:val="false"/>
+                <w:bCs w:val="false"/>
+                <w:i w:val="false"/>
+                <w:iCs w:val="false"/>
+                <w:caps w:val="false"/>
+                <w:sz w:val="20"/>
+                <w:szCs w:val="20"/>
+              </w:rPr>
+              <w:t xml:space="preserve">0,35</w:t>
+            </w:r>
+          </w:p>
+        </w:tc>
+        <w:tc>
+          <w:tcPr>
+            <w:tcW w:type="dxa" w:w="1500"/>
+            <w:tcMar>
+              <w:top w:type="dxa" w:w="60"/>
+              <w:left w:type="dxa" w:w="90"/>
+              <w:bottom w:type="dxa" w:w="60"/>
+              <w:right w:type="dxa" w:w="90"/>
+            </w:tcMar>
+          </w:tcPr>
+          <w:p>
+            <w:pPr>
+              <w:spacing w:line="240"/>
+              <w:jc w:val="left"/>
+            </w:pPr>
+            <w:r>
+              <w:rPr>
+                <w:rFonts w:ascii="Arial" w:cs="Arial" w:eastAsia="Arial" w:hAnsi="Arial"/>
+                <w:b w:val="false"/>
+                <w:bCs w:val="false"/>
+                <w:i w:val="false"/>
+                <w:iCs w:val="false"/>
+                <w:caps w:val="false"/>
+                <w:sz w:val="20"/>
+                <w:szCs w:val="20"/>
+              </w:rPr>
+              <w:t xml:space="preserve">2,10</w:t>
             </w:r>
           </w:p>
         </w:tc>
@@ -29681,43 +29799,43 @@
                 <w:sz w:val="20"/>
                 <w:szCs w:val="20"/>
               </w:rPr>
-              <w:t xml:space="preserve">Circuito instrumentado</w:t>
-            </w:r>
-          </w:p>
-        </w:tc>
-        <w:tc>
-          <w:tcPr>
-            <w:tcW w:type="dxa" w:w="3000"/>
-            <w:tcMar>
-              <w:top w:type="dxa" w:w="60"/>
-              <w:left w:type="dxa" w:w="90"/>
-              <w:bottom w:type="dxa" w:w="60"/>
-              <w:right w:type="dxa" w:w="90"/>
-            </w:tcMar>
-          </w:tcPr>
-          <w:p>
-            <w:pPr>
-              <w:spacing w:line="240"/>
-              <w:jc w:val="left"/>
-            </w:pPr>
-            <w:r>
-              <w:rPr>
-                <w:rFonts w:ascii="Arial" w:cs="Arial" w:eastAsia="Arial" w:hAnsi="Arial"/>
-                <w:b w:val="false"/>
-                <w:bCs w:val="false"/>
-                <w:i w:val="false"/>
-                <w:iCs w:val="false"/>
-                <w:caps w:val="false"/>
-                <w:sz w:val="20"/>
-                <w:szCs w:val="20"/>
-              </w:rPr>
-              <w:t xml:space="preserve">Conjunto de tomadas com cabo paralelo</w:t>
-            </w:r>
-          </w:p>
-        </w:tc>
-        <w:tc>
-          <w:tcPr>
-            <w:tcW w:type="dxa" w:w="700"/>
+              <w:t xml:space="preserve">Conector do sensor</w:t>
+            </w:r>
+          </w:p>
+        </w:tc>
+        <w:tc>
+          <w:tcPr>
+            <w:tcW w:type="dxa" w:w="3200"/>
+            <w:tcMar>
+              <w:top w:type="dxa" w:w="60"/>
+              <w:left w:type="dxa" w:w="90"/>
+              <w:bottom w:type="dxa" w:w="60"/>
+              <w:right w:type="dxa" w:w="90"/>
+            </w:tcMar>
+          </w:tcPr>
+          <w:p>
+            <w:pPr>
+              <w:spacing w:line="240"/>
+              <w:jc w:val="left"/>
+            </w:pPr>
+            <w:r>
+              <w:rPr>
+                <w:rFonts w:ascii="Arial" w:cs="Arial" w:eastAsia="Arial" w:hAnsi="Arial"/>
+                <w:b w:val="false"/>
+                <w:bCs w:val="false"/>
+                <w:i w:val="false"/>
+                <w:iCs w:val="false"/>
+                <w:caps w:val="false"/>
+                <w:sz w:val="20"/>
+                <w:szCs w:val="20"/>
+              </w:rPr>
+              <w:t xml:space="preserve">Borne KRE de 2 vias, passo 5,08 mm</w:t>
+            </w:r>
+          </w:p>
+        </w:tc>
+        <w:tc>
+          <w:tcPr>
+            <w:tcW w:type="dxa" w:w="600"/>
             <w:tcMar>
               <w:top w:type="dxa" w:w="60"/>
               <w:left w:type="dxa" w:w="90"/>
@@ -29747,61 +29865,61 @@
         </w:tc>
         <w:tc>
           <w:tcPr>
-            <w:tcW w:type="dxa" w:w="1900"/>
-            <w:tcMar>
-              <w:top w:type="dxa" w:w="60"/>
-              <w:left w:type="dxa" w:w="90"/>
-              <w:bottom w:type="dxa" w:w="60"/>
-              <w:right w:type="dxa" w:w="90"/>
-            </w:tcMar>
-          </w:tcPr>
-          <w:p>
-            <w:pPr>
-              <w:spacing w:line="240"/>
-              <w:jc w:val="left"/>
-            </w:pPr>
-            <w:r>
-              <w:rPr>
-                <w:rFonts w:ascii="Arial" w:cs="Arial" w:eastAsia="Arial" w:hAnsi="Arial"/>
-                <w:b w:val="false"/>
-                <w:bCs w:val="false"/>
-                <w:i w:val="false"/>
-                <w:iCs w:val="false"/>
-                <w:caps w:val="false"/>
-                <w:sz w:val="20"/>
-                <w:szCs w:val="20"/>
-              </w:rPr>
-              <w:t xml:space="preserve">A preencher</w:t>
-            </w:r>
-          </w:p>
-        </w:tc>
-        <w:tc>
-          <w:tcPr>
-            <w:tcW w:type="dxa" w:w="1900"/>
-            <w:tcMar>
-              <w:top w:type="dxa" w:w="60"/>
-              <w:left w:type="dxa" w:w="90"/>
-              <w:bottom w:type="dxa" w:w="60"/>
-              <w:right w:type="dxa" w:w="90"/>
-            </w:tcMar>
-          </w:tcPr>
-          <w:p>
-            <w:pPr>
-              <w:spacing w:line="240"/>
-              <w:jc w:val="left"/>
-            </w:pPr>
-            <w:r>
-              <w:rPr>
-                <w:rFonts w:ascii="Arial" w:cs="Arial" w:eastAsia="Arial" w:hAnsi="Arial"/>
-                <w:b w:val="false"/>
-                <w:bCs w:val="false"/>
-                <w:i w:val="false"/>
-                <w:iCs w:val="false"/>
-                <w:caps w:val="false"/>
-                <w:sz w:val="20"/>
-                <w:szCs w:val="20"/>
-              </w:rPr>
-              <w:t xml:space="preserve">A preencher</w:t>
+            <w:tcW w:type="dxa" w:w="1800"/>
+            <w:tcMar>
+              <w:top w:type="dxa" w:w="60"/>
+              <w:left w:type="dxa" w:w="90"/>
+              <w:bottom w:type="dxa" w:w="60"/>
+              <w:right w:type="dxa" w:w="90"/>
+            </w:tcMar>
+          </w:tcPr>
+          <w:p>
+            <w:pPr>
+              <w:spacing w:line="240"/>
+              <w:jc w:val="left"/>
+            </w:pPr>
+            <w:r>
+              <w:rPr>
+                <w:rFonts w:ascii="Arial" w:cs="Arial" w:eastAsia="Arial" w:hAnsi="Arial"/>
+                <w:b w:val="false"/>
+                <w:bCs w:val="false"/>
+                <w:i w:val="false"/>
+                <w:iCs w:val="false"/>
+                <w:caps w:val="false"/>
+                <w:sz w:val="20"/>
+                <w:szCs w:val="20"/>
+              </w:rPr>
+              <w:t xml:space="preserve">1,59</w:t>
+            </w:r>
+          </w:p>
+        </w:tc>
+        <w:tc>
+          <w:tcPr>
+            <w:tcW w:type="dxa" w:w="1500"/>
+            <w:tcMar>
+              <w:top w:type="dxa" w:w="60"/>
+              <w:left w:type="dxa" w:w="90"/>
+              <w:bottom w:type="dxa" w:w="60"/>
+              <w:right w:type="dxa" w:w="90"/>
+            </w:tcMar>
+          </w:tcPr>
+          <w:p>
+            <w:pPr>
+              <w:spacing w:line="240"/>
+              <w:jc w:val="left"/>
+            </w:pPr>
+            <w:r>
+              <w:rPr>
+                <w:rFonts w:ascii="Arial" w:cs="Arial" w:eastAsia="Arial" w:hAnsi="Arial"/>
+                <w:b w:val="false"/>
+                <w:bCs w:val="false"/>
+                <w:i w:val="false"/>
+                <w:iCs w:val="false"/>
+                <w:caps w:val="false"/>
+                <w:sz w:val="20"/>
+                <w:szCs w:val="20"/>
+              </w:rPr>
+              <w:t xml:space="preserve">1,59</w:t>
             </w:r>
           </w:p>
         </w:tc>
@@ -29833,127 +29951,127 @@
                 <w:sz w:val="20"/>
                 <w:szCs w:val="20"/>
               </w:rPr>
-              <w:t xml:space="preserve">Carga – motor</w:t>
-            </w:r>
-          </w:p>
-        </w:tc>
-        <w:tc>
-          <w:tcPr>
-            <w:tcW w:type="dxa" w:w="3000"/>
-            <w:tcMar>
-              <w:top w:type="dxa" w:w="60"/>
-              <w:left w:type="dxa" w:w="90"/>
-              <w:bottom w:type="dxa" w:w="60"/>
-              <w:right w:type="dxa" w:w="90"/>
-            </w:tcMar>
-          </w:tcPr>
-          <w:p>
-            <w:pPr>
-              <w:spacing w:line="240"/>
-              <w:jc w:val="left"/>
-            </w:pPr>
-            <w:r>
-              <w:rPr>
-                <w:rFonts w:ascii="Arial" w:cs="Arial" w:eastAsia="Arial" w:hAnsi="Arial"/>
-                <w:b w:val="false"/>
-                <w:bCs w:val="false"/>
-                <w:i w:val="false"/>
-                <w:iCs w:val="false"/>
-                <w:caps w:val="false"/>
-                <w:sz w:val="20"/>
-                <w:szCs w:val="20"/>
-              </w:rPr>
-              <w:t xml:space="preserve">Ventilador de mesa</w:t>
-            </w:r>
-          </w:p>
-        </w:tc>
-        <w:tc>
-          <w:tcPr>
-            <w:tcW w:type="dxa" w:w="700"/>
-            <w:tcMar>
-              <w:top w:type="dxa" w:w="60"/>
-              <w:left w:type="dxa" w:w="90"/>
-              <w:bottom w:type="dxa" w:w="60"/>
-              <w:right w:type="dxa" w:w="90"/>
-            </w:tcMar>
-          </w:tcPr>
-          <w:p>
-            <w:pPr>
-              <w:spacing w:line="240"/>
-              <w:jc w:val="left"/>
-            </w:pPr>
-            <w:r>
-              <w:rPr>
-                <w:rFonts w:ascii="Arial" w:cs="Arial" w:eastAsia="Arial" w:hAnsi="Arial"/>
-                <w:b w:val="false"/>
-                <w:bCs w:val="false"/>
-                <w:i w:val="false"/>
-                <w:iCs w:val="false"/>
-                <w:caps w:val="false"/>
-                <w:sz w:val="20"/>
-                <w:szCs w:val="20"/>
-              </w:rPr>
-              <w:t xml:space="preserve">1</w:t>
-            </w:r>
-          </w:p>
-        </w:tc>
-        <w:tc>
-          <w:tcPr>
-            <w:tcW w:type="dxa" w:w="1900"/>
-            <w:tcMar>
-              <w:top w:type="dxa" w:w="60"/>
-              <w:left w:type="dxa" w:w="90"/>
-              <w:bottom w:type="dxa" w:w="60"/>
-              <w:right w:type="dxa" w:w="90"/>
-            </w:tcMar>
-          </w:tcPr>
-          <w:p>
-            <w:pPr>
-              <w:spacing w:line="240"/>
-              <w:jc w:val="left"/>
-            </w:pPr>
-            <w:r>
-              <w:rPr>
-                <w:rFonts w:ascii="Arial" w:cs="Arial" w:eastAsia="Arial" w:hAnsi="Arial"/>
-                <w:b w:val="false"/>
-                <w:bCs w:val="false"/>
-                <w:i w:val="false"/>
-                <w:iCs w:val="false"/>
-                <w:caps w:val="false"/>
-                <w:sz w:val="20"/>
-                <w:szCs w:val="20"/>
-              </w:rPr>
-              <w:t xml:space="preserve">A preencher</w:t>
-            </w:r>
-          </w:p>
-        </w:tc>
-        <w:tc>
-          <w:tcPr>
-            <w:tcW w:type="dxa" w:w="1900"/>
-            <w:tcMar>
-              <w:top w:type="dxa" w:w="60"/>
-              <w:left w:type="dxa" w:w="90"/>
-              <w:bottom w:type="dxa" w:w="60"/>
-              <w:right w:type="dxa" w:w="90"/>
-            </w:tcMar>
-          </w:tcPr>
-          <w:p>
-            <w:pPr>
-              <w:spacing w:line="240"/>
-              <w:jc w:val="left"/>
-            </w:pPr>
-            <w:r>
-              <w:rPr>
-                <w:rFonts w:ascii="Arial" w:cs="Arial" w:eastAsia="Arial" w:hAnsi="Arial"/>
-                <w:b w:val="false"/>
-                <w:bCs w:val="false"/>
-                <w:i w:val="false"/>
-                <w:iCs w:val="false"/>
-                <w:caps w:val="false"/>
-                <w:sz w:val="20"/>
-                <w:szCs w:val="20"/>
-              </w:rPr>
-              <w:t xml:space="preserve">A preencher</w:t>
+              <w:t xml:space="preserve">Condicionamento de sinal</w:t>
+            </w:r>
+          </w:p>
+        </w:tc>
+        <w:tc>
+          <w:tcPr>
+            <w:tcW w:type="dxa" w:w="3200"/>
+            <w:tcMar>
+              <w:top w:type="dxa" w:w="60"/>
+              <w:left w:type="dxa" w:w="90"/>
+              <w:bottom w:type="dxa" w:w="60"/>
+              <w:right w:type="dxa" w:w="90"/>
+            </w:tcMar>
+          </w:tcPr>
+          <w:p>
+            <w:pPr>
+              <w:spacing w:line="240"/>
+              <w:jc w:val="left"/>
+            </w:pPr>
+            <w:r>
+              <w:rPr>
+                <w:rFonts w:ascii="Arial" w:cs="Arial" w:eastAsia="Arial" w:hAnsi="Arial"/>
+                <w:b w:val="false"/>
+                <w:bCs w:val="false"/>
+                <w:i w:val="false"/>
+                <w:iCs w:val="false"/>
+                <w:caps w:val="false"/>
+                <w:sz w:val="20"/>
+                <w:szCs w:val="20"/>
+              </w:rPr>
+              <w:t xml:space="preserve">Resistor de 10 kΩ, 1/4 W, 5%</w:t>
+            </w:r>
+          </w:p>
+        </w:tc>
+        <w:tc>
+          <w:tcPr>
+            <w:tcW w:type="dxa" w:w="600"/>
+            <w:tcMar>
+              <w:top w:type="dxa" w:w="60"/>
+              <w:left w:type="dxa" w:w="90"/>
+              <w:bottom w:type="dxa" w:w="60"/>
+              <w:right w:type="dxa" w:w="90"/>
+            </w:tcMar>
+          </w:tcPr>
+          <w:p>
+            <w:pPr>
+              <w:spacing w:line="240"/>
+              <w:jc w:val="left"/>
+            </w:pPr>
+            <w:r>
+              <w:rPr>
+                <w:rFonts w:ascii="Arial" w:cs="Arial" w:eastAsia="Arial" w:hAnsi="Arial"/>
+                <w:b w:val="false"/>
+                <w:bCs w:val="false"/>
+                <w:i w:val="false"/>
+                <w:iCs w:val="false"/>
+                <w:caps w:val="false"/>
+                <w:sz w:val="20"/>
+                <w:szCs w:val="20"/>
+              </w:rPr>
+              <w:t xml:space="preserve">2</w:t>
+            </w:r>
+          </w:p>
+        </w:tc>
+        <w:tc>
+          <w:tcPr>
+            <w:tcW w:type="dxa" w:w="1800"/>
+            <w:tcMar>
+              <w:top w:type="dxa" w:w="60"/>
+              <w:left w:type="dxa" w:w="90"/>
+              <w:bottom w:type="dxa" w:w="60"/>
+              <w:right w:type="dxa" w:w="90"/>
+            </w:tcMar>
+          </w:tcPr>
+          <w:p>
+            <w:pPr>
+              <w:spacing w:line="240"/>
+              <w:jc w:val="left"/>
+            </w:pPr>
+            <w:r>
+              <w:rPr>
+                <w:rFonts w:ascii="Arial" w:cs="Arial" w:eastAsia="Arial" w:hAnsi="Arial"/>
+                <w:b w:val="false"/>
+                <w:bCs w:val="false"/>
+                <w:i w:val="false"/>
+                <w:iCs w:val="false"/>
+                <w:caps w:val="false"/>
+                <w:sz w:val="20"/>
+                <w:szCs w:val="20"/>
+              </w:rPr>
+              <w:t xml:space="preserve">0,13</w:t>
+            </w:r>
+          </w:p>
+        </w:tc>
+        <w:tc>
+          <w:tcPr>
+            <w:tcW w:type="dxa" w:w="1500"/>
+            <w:tcMar>
+              <w:top w:type="dxa" w:w="60"/>
+              <w:left w:type="dxa" w:w="90"/>
+              <w:bottom w:type="dxa" w:w="60"/>
+              <w:right w:type="dxa" w:w="90"/>
+            </w:tcMar>
+          </w:tcPr>
+          <w:p>
+            <w:pPr>
+              <w:spacing w:line="240"/>
+              <w:jc w:val="left"/>
+            </w:pPr>
+            <w:r>
+              <w:rPr>
+                <w:rFonts w:ascii="Arial" w:cs="Arial" w:eastAsia="Arial" w:hAnsi="Arial"/>
+                <w:b w:val="false"/>
+                <w:bCs w:val="false"/>
+                <w:i w:val="false"/>
+                <w:iCs w:val="false"/>
+                <w:caps w:val="false"/>
+                <w:sz w:val="20"/>
+                <w:szCs w:val="20"/>
+              </w:rPr>
+              <w:t xml:space="preserve">0,26</w:t>
             </w:r>
           </w:p>
         </w:tc>
@@ -29985,43 +30103,43 @@
                 <w:sz w:val="20"/>
                 <w:szCs w:val="20"/>
               </w:rPr>
-              <w:t xml:space="preserve">Carga – iluminação</w:t>
-            </w:r>
-          </w:p>
-        </w:tc>
-        <w:tc>
-          <w:tcPr>
-            <w:tcW w:type="dxa" w:w="3000"/>
-            <w:tcMar>
-              <w:top w:type="dxa" w:w="60"/>
-              <w:left w:type="dxa" w:w="90"/>
-              <w:bottom w:type="dxa" w:w="60"/>
-              <w:right w:type="dxa" w:w="90"/>
-            </w:tcMar>
-          </w:tcPr>
-          <w:p>
-            <w:pPr>
-              <w:spacing w:line="240"/>
-              <w:jc w:val="left"/>
-            </w:pPr>
-            <w:r>
-              <w:rPr>
-                <w:rFonts w:ascii="Arial" w:cs="Arial" w:eastAsia="Arial" w:hAnsi="Arial"/>
-                <w:b w:val="false"/>
-                <w:bCs w:val="false"/>
-                <w:i w:val="false"/>
-                <w:iCs w:val="false"/>
-                <w:caps w:val="false"/>
-                <w:sz w:val="20"/>
-                <w:szCs w:val="20"/>
-              </w:rPr>
-              <w:t xml:space="preserve">Lâmpada LED com potência declarada</w:t>
-            </w:r>
-          </w:p>
-        </w:tc>
-        <w:tc>
-          <w:tcPr>
-            <w:tcW w:type="dxa" w:w="700"/>
+              <w:t xml:space="preserve">Condicionamento de sinal</w:t>
+            </w:r>
+          </w:p>
+        </w:tc>
+        <w:tc>
+          <w:tcPr>
+            <w:tcW w:type="dxa" w:w="3200"/>
+            <w:tcMar>
+              <w:top w:type="dxa" w:w="60"/>
+              <w:left w:type="dxa" w:w="90"/>
+              <w:bottom w:type="dxa" w:w="60"/>
+              <w:right w:type="dxa" w:w="90"/>
+            </w:tcMar>
+          </w:tcPr>
+          <w:p>
+            <w:pPr>
+              <w:spacing w:line="240"/>
+              <w:jc w:val="left"/>
+            </w:pPr>
+            <w:r>
+              <w:rPr>
+                <w:rFonts w:ascii="Arial" w:cs="Arial" w:eastAsia="Arial" w:hAnsi="Arial"/>
+                <w:b w:val="false"/>
+                <w:bCs w:val="false"/>
+                <w:i w:val="false"/>
+                <w:iCs w:val="false"/>
+                <w:caps w:val="false"/>
+                <w:sz w:val="20"/>
+                <w:szCs w:val="20"/>
+              </w:rPr>
+              <w:t xml:space="preserve">Capacitor eletrolítico de 10 µF / 50 V</w:t>
+            </w:r>
+          </w:p>
+        </w:tc>
+        <w:tc>
+          <w:tcPr>
+            <w:tcW w:type="dxa" w:w="600"/>
             <w:tcMar>
               <w:top w:type="dxa" w:w="60"/>
               <w:left w:type="dxa" w:w="90"/>
@@ -30051,61 +30169,61 @@
         </w:tc>
         <w:tc>
           <w:tcPr>
-            <w:tcW w:type="dxa" w:w="1900"/>
-            <w:tcMar>
-              <w:top w:type="dxa" w:w="60"/>
-              <w:left w:type="dxa" w:w="90"/>
-              <w:bottom w:type="dxa" w:w="60"/>
-              <w:right w:type="dxa" w:w="90"/>
-            </w:tcMar>
-          </w:tcPr>
-          <w:p>
-            <w:pPr>
-              <w:spacing w:line="240"/>
-              <w:jc w:val="left"/>
-            </w:pPr>
-            <w:r>
-              <w:rPr>
-                <w:rFonts w:ascii="Arial" w:cs="Arial" w:eastAsia="Arial" w:hAnsi="Arial"/>
-                <w:b w:val="false"/>
-                <w:bCs w:val="false"/>
-                <w:i w:val="false"/>
-                <w:iCs w:val="false"/>
-                <w:caps w:val="false"/>
-                <w:sz w:val="20"/>
-                <w:szCs w:val="20"/>
-              </w:rPr>
-              <w:t xml:space="preserve">A preencher</w:t>
-            </w:r>
-          </w:p>
-        </w:tc>
-        <w:tc>
-          <w:tcPr>
-            <w:tcW w:type="dxa" w:w="1900"/>
-            <w:tcMar>
-              <w:top w:type="dxa" w:w="60"/>
-              <w:left w:type="dxa" w:w="90"/>
-              <w:bottom w:type="dxa" w:w="60"/>
-              <w:right w:type="dxa" w:w="90"/>
-            </w:tcMar>
-          </w:tcPr>
-          <w:p>
-            <w:pPr>
-              <w:spacing w:line="240"/>
-              <w:jc w:val="left"/>
-            </w:pPr>
-            <w:r>
-              <w:rPr>
-                <w:rFonts w:ascii="Arial" w:cs="Arial" w:eastAsia="Arial" w:hAnsi="Arial"/>
-                <w:b w:val="false"/>
-                <w:bCs w:val="false"/>
-                <w:i w:val="false"/>
-                <w:iCs w:val="false"/>
-                <w:caps w:val="false"/>
-                <w:sz w:val="20"/>
-                <w:szCs w:val="20"/>
-              </w:rPr>
-              <w:t xml:space="preserve">A preencher</w:t>
+            <w:tcW w:type="dxa" w:w="1800"/>
+            <w:tcMar>
+              <w:top w:type="dxa" w:w="60"/>
+              <w:left w:type="dxa" w:w="90"/>
+              <w:bottom w:type="dxa" w:w="60"/>
+              <w:right w:type="dxa" w:w="90"/>
+            </w:tcMar>
+          </w:tcPr>
+          <w:p>
+            <w:pPr>
+              <w:spacing w:line="240"/>
+              <w:jc w:val="left"/>
+            </w:pPr>
+            <w:r>
+              <w:rPr>
+                <w:rFonts w:ascii="Arial" w:cs="Arial" w:eastAsia="Arial" w:hAnsi="Arial"/>
+                <w:b w:val="false"/>
+                <w:bCs w:val="false"/>
+                <w:i w:val="false"/>
+                <w:iCs w:val="false"/>
+                <w:caps w:val="false"/>
+                <w:sz w:val="20"/>
+                <w:szCs w:val="20"/>
+              </w:rPr>
+              <w:t xml:space="preserve">1,29</w:t>
+            </w:r>
+          </w:p>
+        </w:tc>
+        <w:tc>
+          <w:tcPr>
+            <w:tcW w:type="dxa" w:w="1500"/>
+            <w:tcMar>
+              <w:top w:type="dxa" w:w="60"/>
+              <w:left w:type="dxa" w:w="90"/>
+              <w:bottom w:type="dxa" w:w="60"/>
+              <w:right w:type="dxa" w:w="90"/>
+            </w:tcMar>
+          </w:tcPr>
+          <w:p>
+            <w:pPr>
+              <w:spacing w:line="240"/>
+              <w:jc w:val="left"/>
+            </w:pPr>
+            <w:r>
+              <w:rPr>
+                <w:rFonts w:ascii="Arial" w:cs="Arial" w:eastAsia="Arial" w:hAnsi="Arial"/>
+                <w:b w:val="false"/>
+                <w:bCs w:val="false"/>
+                <w:i w:val="false"/>
+                <w:iCs w:val="false"/>
+                <w:caps w:val="false"/>
+                <w:sz w:val="20"/>
+                <w:szCs w:val="20"/>
+              </w:rPr>
+              <w:t xml:space="preserve">1,29</w:t>
             </w:r>
           </w:p>
         </w:tc>
@@ -30137,127 +30255,127 @@
                 <w:sz w:val="20"/>
                 <w:szCs w:val="20"/>
               </w:rPr>
-              <w:t xml:space="preserve">Prototipagem</w:t>
-            </w:r>
-          </w:p>
-        </w:tc>
-        <w:tc>
-          <w:tcPr>
-            <w:tcW w:type="dxa" w:w="3000"/>
-            <w:tcMar>
-              <w:top w:type="dxa" w:w="60"/>
-              <w:left w:type="dxa" w:w="90"/>
-              <w:bottom w:type="dxa" w:w="60"/>
-              <w:right w:type="dxa" w:w="90"/>
-            </w:tcMar>
-          </w:tcPr>
-          <w:p>
-            <w:pPr>
-              <w:spacing w:line="240"/>
-              <w:jc w:val="left"/>
-            </w:pPr>
-            <w:r>
-              <w:rPr>
-                <w:rFonts w:ascii="Arial" w:cs="Arial" w:eastAsia="Arial" w:hAnsi="Arial"/>
-                <w:b w:val="false"/>
-                <w:bCs w:val="false"/>
-                <w:i w:val="false"/>
-                <w:iCs w:val="false"/>
-                <w:caps w:val="false"/>
-                <w:sz w:val="20"/>
-                <w:szCs w:val="20"/>
-              </w:rPr>
-              <w:t xml:space="preserve">Protoboard, jumpers e barra de pinos</w:t>
-            </w:r>
-          </w:p>
-        </w:tc>
-        <w:tc>
-          <w:tcPr>
-            <w:tcW w:type="dxa" w:w="700"/>
-            <w:tcMar>
-              <w:top w:type="dxa" w:w="60"/>
-              <w:left w:type="dxa" w:w="90"/>
-              <w:bottom w:type="dxa" w:w="60"/>
-              <w:right w:type="dxa" w:w="90"/>
-            </w:tcMar>
-          </w:tcPr>
-          <w:p>
-            <w:pPr>
-              <w:spacing w:line="240"/>
-              <w:jc w:val="left"/>
-            </w:pPr>
-            <w:r>
-              <w:rPr>
-                <w:rFonts w:ascii="Arial" w:cs="Arial" w:eastAsia="Arial" w:hAnsi="Arial"/>
-                <w:b w:val="false"/>
-                <w:bCs w:val="false"/>
-                <w:i w:val="false"/>
-                <w:iCs w:val="false"/>
-                <w:caps w:val="false"/>
-                <w:sz w:val="20"/>
-                <w:szCs w:val="20"/>
-              </w:rPr>
-              <w:t xml:space="preserve">1</w:t>
-            </w:r>
-          </w:p>
-        </w:tc>
-        <w:tc>
-          <w:tcPr>
-            <w:tcW w:type="dxa" w:w="1900"/>
-            <w:tcMar>
-              <w:top w:type="dxa" w:w="60"/>
-              <w:left w:type="dxa" w:w="90"/>
-              <w:bottom w:type="dxa" w:w="60"/>
-              <w:right w:type="dxa" w:w="90"/>
-            </w:tcMar>
-          </w:tcPr>
-          <w:p>
-            <w:pPr>
-              <w:spacing w:line="240"/>
-              <w:jc w:val="left"/>
-            </w:pPr>
-            <w:r>
-              <w:rPr>
-                <w:rFonts w:ascii="Arial" w:cs="Arial" w:eastAsia="Arial" w:hAnsi="Arial"/>
-                <w:b w:val="false"/>
-                <w:bCs w:val="false"/>
-                <w:i w:val="false"/>
-                <w:iCs w:val="false"/>
-                <w:caps w:val="false"/>
-                <w:sz w:val="20"/>
-                <w:szCs w:val="20"/>
-              </w:rPr>
-              <w:t xml:space="preserve">A preencher</w:t>
-            </w:r>
-          </w:p>
-        </w:tc>
-        <w:tc>
-          <w:tcPr>
-            <w:tcW w:type="dxa" w:w="1900"/>
-            <w:tcMar>
-              <w:top w:type="dxa" w:w="60"/>
-              <w:left w:type="dxa" w:w="90"/>
-              <w:bottom w:type="dxa" w:w="60"/>
-              <w:right w:type="dxa" w:w="90"/>
-            </w:tcMar>
-          </w:tcPr>
-          <w:p>
-            <w:pPr>
-              <w:spacing w:line="240"/>
-              <w:jc w:val="left"/>
-            </w:pPr>
-            <w:r>
-              <w:rPr>
-                <w:rFonts w:ascii="Arial" w:cs="Arial" w:eastAsia="Arial" w:hAnsi="Arial"/>
-                <w:b w:val="false"/>
-                <w:bCs w:val="false"/>
-                <w:i w:val="false"/>
-                <w:iCs w:val="false"/>
-                <w:caps w:val="false"/>
-                <w:sz w:val="20"/>
-                <w:szCs w:val="20"/>
-              </w:rPr>
-              <w:t xml:space="preserve">A preencher</w:t>
+              <w:t xml:space="preserve"/>
+            </w:r>
+          </w:p>
+        </w:tc>
+        <w:tc>
+          <w:tcPr>
+            <w:tcW w:type="dxa" w:w="3200"/>
+            <w:tcMar>
+              <w:top w:type="dxa" w:w="60"/>
+              <w:left w:type="dxa" w:w="90"/>
+              <w:bottom w:type="dxa" w:w="60"/>
+              <w:right w:type="dxa" w:w="90"/>
+            </w:tcMar>
+          </w:tcPr>
+          <w:p>
+            <w:pPr>
+              <w:spacing w:line="240"/>
+              <w:jc w:val="left"/>
+            </w:pPr>
+            <w:r>
+              <w:rPr>
+                <w:rFonts w:ascii="Arial" w:cs="Arial" w:eastAsia="Arial" w:hAnsi="Arial"/>
+                <w:b w:val="false"/>
+                <w:bCs w:val="false"/>
+                <w:i w:val="false"/>
+                <w:iCs w:val="false"/>
+                <w:caps w:val="false"/>
+                <w:sz w:val="20"/>
+                <w:szCs w:val="20"/>
+              </w:rPr>
+              <w:t xml:space="preserve"/>
+            </w:r>
+          </w:p>
+        </w:tc>
+        <w:tc>
+          <w:tcPr>
+            <w:tcW w:type="dxa" w:w="600"/>
+            <w:tcMar>
+              <w:top w:type="dxa" w:w="60"/>
+              <w:left w:type="dxa" w:w="90"/>
+              <w:bottom w:type="dxa" w:w="60"/>
+              <w:right w:type="dxa" w:w="90"/>
+            </w:tcMar>
+          </w:tcPr>
+          <w:p>
+            <w:pPr>
+              <w:spacing w:line="240"/>
+              <w:jc w:val="left"/>
+            </w:pPr>
+            <w:r>
+              <w:rPr>
+                <w:rFonts w:ascii="Arial" w:cs="Arial" w:eastAsia="Arial" w:hAnsi="Arial"/>
+                <w:b w:val="false"/>
+                <w:bCs w:val="false"/>
+                <w:i w:val="false"/>
+                <w:iCs w:val="false"/>
+                <w:caps w:val="false"/>
+                <w:sz w:val="20"/>
+                <w:szCs w:val="20"/>
+              </w:rPr>
+              <w:t xml:space="preserve"/>
+            </w:r>
+          </w:p>
+        </w:tc>
+        <w:tc>
+          <w:tcPr>
+            <w:tcW w:type="dxa" w:w="1800"/>
+            <w:tcMar>
+              <w:top w:type="dxa" w:w="60"/>
+              <w:left w:type="dxa" w:w="90"/>
+              <w:bottom w:type="dxa" w:w="60"/>
+              <w:right w:type="dxa" w:w="90"/>
+            </w:tcMar>
+          </w:tcPr>
+          <w:p>
+            <w:pPr>
+              <w:spacing w:line="240"/>
+              <w:jc w:val="left"/>
+            </w:pPr>
+            <w:r>
+              <w:rPr>
+                <w:rFonts w:ascii="Arial" w:cs="Arial" w:eastAsia="Arial" w:hAnsi="Arial"/>
+                <w:b w:val="false"/>
+                <w:bCs w:val="false"/>
+                <w:i w:val="false"/>
+                <w:iCs w:val="false"/>
+                <w:caps w:val="false"/>
+                <w:sz w:val="20"/>
+                <w:szCs w:val="20"/>
+              </w:rPr>
+              <w:t xml:space="preserve">Subtotal do nó de medição</w:t>
+            </w:r>
+          </w:p>
+        </w:tc>
+        <w:tc>
+          <w:tcPr>
+            <w:tcW w:type="dxa" w:w="1500"/>
+            <w:tcMar>
+              <w:top w:type="dxa" w:w="60"/>
+              <w:left w:type="dxa" w:w="90"/>
+              <w:bottom w:type="dxa" w:w="60"/>
+              <w:right w:type="dxa" w:w="90"/>
+            </w:tcMar>
+          </w:tcPr>
+          <w:p>
+            <w:pPr>
+              <w:spacing w:line="240"/>
+              <w:jc w:val="left"/>
+            </w:pPr>
+            <w:r>
+              <w:rPr>
+                <w:rFonts w:ascii="Arial" w:cs="Arial" w:eastAsia="Arial" w:hAnsi="Arial"/>
+                <w:b w:val="false"/>
+                <w:bCs w:val="false"/>
+                <w:i w:val="false"/>
+                <w:iCs w:val="false"/>
+                <w:caps w:val="false"/>
+                <w:sz w:val="20"/>
+                <w:szCs w:val="20"/>
+              </w:rPr>
+              <w:t xml:space="preserve">152,08</w:t>
             </w:r>
           </w:p>
         </w:tc>
@@ -30289,43 +30407,43 @@
                 <w:sz w:val="20"/>
                 <w:szCs w:val="20"/>
               </w:rPr>
-              <w:t xml:space="preserve">Gravação e alimentação</w:t>
-            </w:r>
-          </w:p>
-        </w:tc>
-        <w:tc>
-          <w:tcPr>
-            <w:tcW w:type="dxa" w:w="3000"/>
-            <w:tcMar>
-              <w:top w:type="dxa" w:w="60"/>
-              <w:left w:type="dxa" w:w="90"/>
-              <w:bottom w:type="dxa" w:w="60"/>
-              <w:right w:type="dxa" w:w="90"/>
-            </w:tcMar>
-          </w:tcPr>
-          <w:p>
-            <w:pPr>
-              <w:spacing w:line="240"/>
-              <w:jc w:val="left"/>
-            </w:pPr>
-            <w:r>
-              <w:rPr>
-                <w:rFonts w:ascii="Arial" w:cs="Arial" w:eastAsia="Arial" w:hAnsi="Arial"/>
-                <w:b w:val="false"/>
-                <w:bCs w:val="false"/>
-                <w:i w:val="false"/>
-                <w:iCs w:val="false"/>
-                <w:caps w:val="false"/>
-                <w:sz w:val="20"/>
-                <w:szCs w:val="20"/>
-              </w:rPr>
-              <w:t xml:space="preserve">Cabo micro-USB com vias de dados</w:t>
-            </w:r>
-          </w:p>
-        </w:tc>
-        <w:tc>
-          <w:tcPr>
-            <w:tcW w:type="dxa" w:w="700"/>
+              <w:t xml:space="preserve">Instrumento de referência</w:t>
+            </w:r>
+          </w:p>
+        </w:tc>
+        <w:tc>
+          <w:tcPr>
+            <w:tcW w:type="dxa" w:w="3200"/>
+            <w:tcMar>
+              <w:top w:type="dxa" w:w="60"/>
+              <w:left w:type="dxa" w:w="90"/>
+              <w:bottom w:type="dxa" w:w="60"/>
+              <w:right w:type="dxa" w:w="90"/>
+            </w:tcMar>
+          </w:tcPr>
+          <w:p>
+            <w:pPr>
+              <w:spacing w:line="240"/>
+              <w:jc w:val="left"/>
+            </w:pPr>
+            <w:r>
+              <w:rPr>
+                <w:rFonts w:ascii="Arial" w:cs="Arial" w:eastAsia="Arial" w:hAnsi="Arial"/>
+                <w:b w:val="false"/>
+                <w:bCs w:val="false"/>
+                <w:i w:val="false"/>
+                <w:iCs w:val="false"/>
+                <w:caps w:val="false"/>
+                <w:sz w:val="20"/>
+                <w:szCs w:val="20"/>
+              </w:rPr>
+              <w:t xml:space="preserve">Wattímetro de tomada, bivolt, com indicação de fator de potência</w:t>
+            </w:r>
+          </w:p>
+        </w:tc>
+        <w:tc>
+          <w:tcPr>
+            <w:tcW w:type="dxa" w:w="600"/>
             <w:tcMar>
               <w:top w:type="dxa" w:w="60"/>
               <w:left w:type="dxa" w:w="90"/>
@@ -30355,61 +30473,61 @@
         </w:tc>
         <w:tc>
           <w:tcPr>
-            <w:tcW w:type="dxa" w:w="1900"/>
-            <w:tcMar>
-              <w:top w:type="dxa" w:w="60"/>
-              <w:left w:type="dxa" w:w="90"/>
-              <w:bottom w:type="dxa" w:w="60"/>
-              <w:right w:type="dxa" w:w="90"/>
-            </w:tcMar>
-          </w:tcPr>
-          <w:p>
-            <w:pPr>
-              <w:spacing w:line="240"/>
-              <w:jc w:val="left"/>
-            </w:pPr>
-            <w:r>
-              <w:rPr>
-                <w:rFonts w:ascii="Arial" w:cs="Arial" w:eastAsia="Arial" w:hAnsi="Arial"/>
-                <w:b w:val="false"/>
-                <w:bCs w:val="false"/>
-                <w:i w:val="false"/>
-                <w:iCs w:val="false"/>
-                <w:caps w:val="false"/>
-                <w:sz w:val="20"/>
-                <w:szCs w:val="20"/>
-              </w:rPr>
-              <w:t xml:space="preserve">A preencher</w:t>
-            </w:r>
-          </w:p>
-        </w:tc>
-        <w:tc>
-          <w:tcPr>
-            <w:tcW w:type="dxa" w:w="1900"/>
-            <w:tcMar>
-              <w:top w:type="dxa" w:w="60"/>
-              <w:left w:type="dxa" w:w="90"/>
-              <w:bottom w:type="dxa" w:w="60"/>
-              <w:right w:type="dxa" w:w="90"/>
-            </w:tcMar>
-          </w:tcPr>
-          <w:p>
-            <w:pPr>
-              <w:spacing w:line="240"/>
-              <w:jc w:val="left"/>
-            </w:pPr>
-            <w:r>
-              <w:rPr>
-                <w:rFonts w:ascii="Arial" w:cs="Arial" w:eastAsia="Arial" w:hAnsi="Arial"/>
-                <w:b w:val="false"/>
-                <w:bCs w:val="false"/>
-                <w:i w:val="false"/>
-                <w:iCs w:val="false"/>
-                <w:caps w:val="false"/>
-                <w:sz w:val="20"/>
-                <w:szCs w:val="20"/>
-              </w:rPr>
-              <w:t xml:space="preserve">A preencher</w:t>
+            <w:tcW w:type="dxa" w:w="1800"/>
+            <w:tcMar>
+              <w:top w:type="dxa" w:w="60"/>
+              <w:left w:type="dxa" w:w="90"/>
+              <w:bottom w:type="dxa" w:w="60"/>
+              <w:right w:type="dxa" w:w="90"/>
+            </w:tcMar>
+          </w:tcPr>
+          <w:p>
+            <w:pPr>
+              <w:spacing w:line="240"/>
+              <w:jc w:val="left"/>
+            </w:pPr>
+            <w:r>
+              <w:rPr>
+                <w:rFonts w:ascii="Arial" w:cs="Arial" w:eastAsia="Arial" w:hAnsi="Arial"/>
+                <w:b w:val="false"/>
+                <w:bCs w:val="false"/>
+                <w:i w:val="false"/>
+                <w:iCs w:val="false"/>
+                <w:caps w:val="false"/>
+                <w:sz w:val="20"/>
+                <w:szCs w:val="20"/>
+              </w:rPr>
+              <w:t xml:space="preserve">74,90</w:t>
+            </w:r>
+          </w:p>
+        </w:tc>
+        <w:tc>
+          <w:tcPr>
+            <w:tcW w:type="dxa" w:w="1500"/>
+            <w:tcMar>
+              <w:top w:type="dxa" w:w="60"/>
+              <w:left w:type="dxa" w:w="90"/>
+              <w:bottom w:type="dxa" w:w="60"/>
+              <w:right w:type="dxa" w:w="90"/>
+            </w:tcMar>
+          </w:tcPr>
+          <w:p>
+            <w:pPr>
+              <w:spacing w:line="240"/>
+              <w:jc w:val="left"/>
+            </w:pPr>
+            <w:r>
+              <w:rPr>
+                <w:rFonts w:ascii="Arial" w:cs="Arial" w:eastAsia="Arial" w:hAnsi="Arial"/>
+                <w:b w:val="false"/>
+                <w:bCs w:val="false"/>
+                <w:i w:val="false"/>
+                <w:iCs w:val="false"/>
+                <w:caps w:val="false"/>
+                <w:sz w:val="20"/>
+                <w:szCs w:val="20"/>
+              </w:rPr>
+              <w:t xml:space="preserve">74,90</w:t>
             </w:r>
           </w:p>
         </w:tc>
@@ -30441,43 +30559,43 @@
                 <w:sz w:val="20"/>
                 <w:szCs w:val="20"/>
               </w:rPr>
-              <w:t xml:space="preserve">Instrumento de referência</w:t>
-            </w:r>
-          </w:p>
-        </w:tc>
-        <w:tc>
-          <w:tcPr>
-            <w:tcW w:type="dxa" w:w="3000"/>
-            <w:tcMar>
-              <w:top w:type="dxa" w:w="60"/>
-              <w:left w:type="dxa" w:w="90"/>
-              <w:bottom w:type="dxa" w:w="60"/>
-              <w:right w:type="dxa" w:w="90"/>
-            </w:tcMar>
-          </w:tcPr>
-          <w:p>
-            <w:pPr>
-              <w:spacing w:line="240"/>
-              <w:jc w:val="left"/>
-            </w:pPr>
-            <w:r>
-              <w:rPr>
-                <w:rFonts w:ascii="Arial" w:cs="Arial" w:eastAsia="Arial" w:hAnsi="Arial"/>
-                <w:b w:val="false"/>
-                <w:bCs w:val="false"/>
-                <w:i w:val="false"/>
-                <w:iCs w:val="false"/>
-                <w:caps w:val="false"/>
-                <w:sz w:val="20"/>
-                <w:szCs w:val="20"/>
-              </w:rPr>
-              <w:t xml:space="preserve">Medidor de consumo de tomada (wattímetro)</w:t>
-            </w:r>
-          </w:p>
-        </w:tc>
-        <w:tc>
-          <w:tcPr>
-            <w:tcW w:type="dxa" w:w="700"/>
+              <w:t xml:space="preserve">Circuito instrumentado</w:t>
+            </w:r>
+          </w:p>
+        </w:tc>
+        <w:tc>
+          <w:tcPr>
+            <w:tcW w:type="dxa" w:w="3200"/>
+            <w:tcMar>
+              <w:top w:type="dxa" w:w="60"/>
+              <w:left w:type="dxa" w:w="90"/>
+              <w:bottom w:type="dxa" w:w="60"/>
+              <w:right w:type="dxa" w:w="90"/>
+            </w:tcMar>
+          </w:tcPr>
+          <w:p>
+            <w:pPr>
+              <w:spacing w:line="240"/>
+              <w:jc w:val="left"/>
+            </w:pPr>
+            <w:r>
+              <w:rPr>
+                <w:rFonts w:ascii="Arial" w:cs="Arial" w:eastAsia="Arial" w:hAnsi="Arial"/>
+                <w:b w:val="false"/>
+                <w:bCs w:val="false"/>
+                <w:i w:val="false"/>
+                <w:iCs w:val="false"/>
+                <w:caps w:val="false"/>
+                <w:sz w:val="20"/>
+                <w:szCs w:val="20"/>
+              </w:rPr>
+              <w:t xml:space="preserve">Extensão elétrica de 3 tomadas, cordão paralelo 2 × 0,75 mm², 3 m</w:t>
+            </w:r>
+          </w:p>
+        </w:tc>
+        <w:tc>
+          <w:tcPr>
+            <w:tcW w:type="dxa" w:w="600"/>
             <w:tcMar>
               <w:top w:type="dxa" w:w="60"/>
               <w:left w:type="dxa" w:w="90"/>
@@ -30507,61 +30625,61 @@
         </w:tc>
         <w:tc>
           <w:tcPr>
-            <w:tcW w:type="dxa" w:w="1900"/>
-            <w:tcMar>
-              <w:top w:type="dxa" w:w="60"/>
-              <w:left w:type="dxa" w:w="90"/>
-              <w:bottom w:type="dxa" w:w="60"/>
-              <w:right w:type="dxa" w:w="90"/>
-            </w:tcMar>
-          </w:tcPr>
-          <w:p>
-            <w:pPr>
-              <w:spacing w:line="240"/>
-              <w:jc w:val="left"/>
-            </w:pPr>
-            <w:r>
-              <w:rPr>
-                <w:rFonts w:ascii="Arial" w:cs="Arial" w:eastAsia="Arial" w:hAnsi="Arial"/>
-                <w:b w:val="false"/>
-                <w:bCs w:val="false"/>
-                <w:i w:val="false"/>
-                <w:iCs w:val="false"/>
-                <w:caps w:val="false"/>
-                <w:sz w:val="20"/>
-                <w:szCs w:val="20"/>
-              </w:rPr>
-              <w:t xml:space="preserve">A preencher</w:t>
-            </w:r>
-          </w:p>
-        </w:tc>
-        <w:tc>
-          <w:tcPr>
-            <w:tcW w:type="dxa" w:w="1900"/>
-            <w:tcMar>
-              <w:top w:type="dxa" w:w="60"/>
-              <w:left w:type="dxa" w:w="90"/>
-              <w:bottom w:type="dxa" w:w="60"/>
-              <w:right w:type="dxa" w:w="90"/>
-            </w:tcMar>
-          </w:tcPr>
-          <w:p>
-            <w:pPr>
-              <w:spacing w:line="240"/>
-              <w:jc w:val="left"/>
-            </w:pPr>
-            <w:r>
-              <w:rPr>
-                <w:rFonts w:ascii="Arial" w:cs="Arial" w:eastAsia="Arial" w:hAnsi="Arial"/>
-                <w:b w:val="false"/>
-                <w:bCs w:val="false"/>
-                <w:i w:val="false"/>
-                <w:iCs w:val="false"/>
-                <w:caps w:val="false"/>
-                <w:sz w:val="20"/>
-                <w:szCs w:val="20"/>
-              </w:rPr>
-              <w:t xml:space="preserve">A preencher</w:t>
+            <w:tcW w:type="dxa" w:w="1800"/>
+            <w:tcMar>
+              <w:top w:type="dxa" w:w="60"/>
+              <w:left w:type="dxa" w:w="90"/>
+              <w:bottom w:type="dxa" w:w="60"/>
+              <w:right w:type="dxa" w:w="90"/>
+            </w:tcMar>
+          </w:tcPr>
+          <w:p>
+            <w:pPr>
+              <w:spacing w:line="240"/>
+              <w:jc w:val="left"/>
+            </w:pPr>
+            <w:r>
+              <w:rPr>
+                <w:rFonts w:ascii="Arial" w:cs="Arial" w:eastAsia="Arial" w:hAnsi="Arial"/>
+                <w:b w:val="false"/>
+                <w:bCs w:val="false"/>
+                <w:i w:val="false"/>
+                <w:iCs w:val="false"/>
+                <w:caps w:val="false"/>
+                <w:sz w:val="20"/>
+                <w:szCs w:val="20"/>
+              </w:rPr>
+              <w:t xml:space="preserve">24,90</w:t>
+            </w:r>
+          </w:p>
+        </w:tc>
+        <w:tc>
+          <w:tcPr>
+            <w:tcW w:type="dxa" w:w="1500"/>
+            <w:tcMar>
+              <w:top w:type="dxa" w:w="60"/>
+              <w:left w:type="dxa" w:w="90"/>
+              <w:bottom w:type="dxa" w:w="60"/>
+              <w:right w:type="dxa" w:w="90"/>
+            </w:tcMar>
+          </w:tcPr>
+          <w:p>
+            <w:pPr>
+              <w:spacing w:line="240"/>
+              <w:jc w:val="left"/>
+            </w:pPr>
+            <w:r>
+              <w:rPr>
+                <w:rFonts w:ascii="Arial" w:cs="Arial" w:eastAsia="Arial" w:hAnsi="Arial"/>
+                <w:b w:val="false"/>
+                <w:bCs w:val="false"/>
+                <w:i w:val="false"/>
+                <w:iCs w:val="false"/>
+                <w:caps w:val="false"/>
+                <w:sz w:val="20"/>
+                <w:szCs w:val="20"/>
+              </w:rPr>
+              <w:t xml:space="preserve">24,90</w:t>
             </w:r>
           </w:p>
         </w:tc>
@@ -30593,43 +30711,43 @@
                 <w:sz w:val="20"/>
                 <w:szCs w:val="20"/>
               </w:rPr>
-              <w:t xml:space="preserve">Estrutura</w:t>
-            </w:r>
-          </w:p>
-        </w:tc>
-        <w:tc>
-          <w:tcPr>
-            <w:tcW w:type="dxa" w:w="3000"/>
-            <w:tcMar>
-              <w:top w:type="dxa" w:w="60"/>
-              <w:left w:type="dxa" w:w="90"/>
-              <w:bottom w:type="dxa" w:w="60"/>
-              <w:right w:type="dxa" w:w="90"/>
-            </w:tcMar>
-          </w:tcPr>
-          <w:p>
-            <w:pPr>
-              <w:spacing w:line="240"/>
-              <w:jc w:val="left"/>
-            </w:pPr>
-            <w:r>
-              <w:rPr>
-                <w:rFonts w:ascii="Arial" w:cs="Arial" w:eastAsia="Arial" w:hAnsi="Arial"/>
-                <w:b w:val="false"/>
-                <w:bCs w:val="false"/>
-                <w:i w:val="false"/>
-                <w:iCs w:val="false"/>
-                <w:caps w:val="false"/>
-                <w:sz w:val="20"/>
-                <w:szCs w:val="20"/>
-              </w:rPr>
-              <w:t xml:space="preserve">Base de montagem e organização de cabos</w:t>
-            </w:r>
-          </w:p>
-        </w:tc>
-        <w:tc>
-          <w:tcPr>
-            <w:tcW w:type="dxa" w:w="700"/>
+              <w:t xml:space="preserve">Adaptador</w:t>
+            </w:r>
+          </w:p>
+        </w:tc>
+        <w:tc>
+          <w:tcPr>
+            <w:tcW w:type="dxa" w:w="3200"/>
+            <w:tcMar>
+              <w:top w:type="dxa" w:w="60"/>
+              <w:left w:type="dxa" w:w="90"/>
+              <w:bottom w:type="dxa" w:w="60"/>
+              <w:right w:type="dxa" w:w="90"/>
+            </w:tcMar>
+          </w:tcPr>
+          <w:p>
+            <w:pPr>
+              <w:spacing w:line="240"/>
+              <w:jc w:val="left"/>
+            </w:pPr>
+            <w:r>
+              <w:rPr>
+                <w:rFonts w:ascii="Arial" w:cs="Arial" w:eastAsia="Arial" w:hAnsi="Arial"/>
+                <w:b w:val="false"/>
+                <w:bCs w:val="false"/>
+                <w:i w:val="false"/>
+                <w:iCs w:val="false"/>
+                <w:caps w:val="false"/>
+                <w:sz w:val="20"/>
+                <w:szCs w:val="20"/>
+              </w:rPr>
+              <w:t xml:space="preserve">Adaptador de plugue de três para dois pinos</w:t>
+            </w:r>
+          </w:p>
+        </w:tc>
+        <w:tc>
+          <w:tcPr>
+            <w:tcW w:type="dxa" w:w="600"/>
             <w:tcMar>
               <w:top w:type="dxa" w:w="60"/>
               <w:left w:type="dxa" w:w="90"/>
@@ -30659,61 +30777,61 @@
         </w:tc>
         <w:tc>
           <w:tcPr>
-            <w:tcW w:type="dxa" w:w="1900"/>
-            <w:tcMar>
-              <w:top w:type="dxa" w:w="60"/>
-              <w:left w:type="dxa" w:w="90"/>
-              <w:bottom w:type="dxa" w:w="60"/>
-              <w:right w:type="dxa" w:w="90"/>
-            </w:tcMar>
-          </w:tcPr>
-          <w:p>
-            <w:pPr>
-              <w:spacing w:line="240"/>
-              <w:jc w:val="left"/>
-            </w:pPr>
-            <w:r>
-              <w:rPr>
-                <w:rFonts w:ascii="Arial" w:cs="Arial" w:eastAsia="Arial" w:hAnsi="Arial"/>
-                <w:b w:val="false"/>
-                <w:bCs w:val="false"/>
-                <w:i w:val="false"/>
-                <w:iCs w:val="false"/>
-                <w:caps w:val="false"/>
-                <w:sz w:val="20"/>
-                <w:szCs w:val="20"/>
-              </w:rPr>
-              <w:t xml:space="preserve">A preencher</w:t>
-            </w:r>
-          </w:p>
-        </w:tc>
-        <w:tc>
-          <w:tcPr>
-            <w:tcW w:type="dxa" w:w="1900"/>
-            <w:tcMar>
-              <w:top w:type="dxa" w:w="60"/>
-              <w:left w:type="dxa" w:w="90"/>
-              <w:bottom w:type="dxa" w:w="60"/>
-              <w:right w:type="dxa" w:w="90"/>
-            </w:tcMar>
-          </w:tcPr>
-          <w:p>
-            <w:pPr>
-              <w:spacing w:line="240"/>
-              <w:jc w:val="left"/>
-            </w:pPr>
-            <w:r>
-              <w:rPr>
-                <w:rFonts w:ascii="Arial" w:cs="Arial" w:eastAsia="Arial" w:hAnsi="Arial"/>
-                <w:b w:val="false"/>
-                <w:bCs w:val="false"/>
-                <w:i w:val="false"/>
-                <w:iCs w:val="false"/>
-                <w:caps w:val="false"/>
-                <w:sz w:val="20"/>
-                <w:szCs w:val="20"/>
-              </w:rPr>
-              <w:t xml:space="preserve">A preencher</w:t>
+            <w:tcW w:type="dxa" w:w="1800"/>
+            <w:tcMar>
+              <w:top w:type="dxa" w:w="60"/>
+              <w:left w:type="dxa" w:w="90"/>
+              <w:bottom w:type="dxa" w:w="60"/>
+              <w:right w:type="dxa" w:w="90"/>
+            </w:tcMar>
+          </w:tcPr>
+          <w:p>
+            <w:pPr>
+              <w:spacing w:line="240"/>
+              <w:jc w:val="left"/>
+            </w:pPr>
+            <w:r>
+              <w:rPr>
+                <w:rFonts w:ascii="Arial" w:cs="Arial" w:eastAsia="Arial" w:hAnsi="Arial"/>
+                <w:b w:val="false"/>
+                <w:bCs w:val="false"/>
+                <w:i w:val="false"/>
+                <w:iCs w:val="false"/>
+                <w:caps w:val="false"/>
+                <w:sz w:val="20"/>
+                <w:szCs w:val="20"/>
+              </w:rPr>
+              <w:t xml:space="preserve">5,00</w:t>
+            </w:r>
+          </w:p>
+        </w:tc>
+        <w:tc>
+          <w:tcPr>
+            <w:tcW w:type="dxa" w:w="1500"/>
+            <w:tcMar>
+              <w:top w:type="dxa" w:w="60"/>
+              <w:left w:type="dxa" w:w="90"/>
+              <w:bottom w:type="dxa" w:w="60"/>
+              <w:right w:type="dxa" w:w="90"/>
+            </w:tcMar>
+          </w:tcPr>
+          <w:p>
+            <w:pPr>
+              <w:spacing w:line="240"/>
+              <w:jc w:val="left"/>
+            </w:pPr>
+            <w:r>
+              <w:rPr>
+                <w:rFonts w:ascii="Arial" w:cs="Arial" w:eastAsia="Arial" w:hAnsi="Arial"/>
+                <w:b w:val="false"/>
+                <w:bCs w:val="false"/>
+                <w:i w:val="false"/>
+                <w:iCs w:val="false"/>
+                <w:caps w:val="false"/>
+                <w:sz w:val="20"/>
+                <w:szCs w:val="20"/>
+              </w:rPr>
+              <w:t xml:space="preserve">5,00</w:t>
             </w:r>
           </w:p>
         </w:tc>
@@ -30751,7 +30869,7 @@
         </w:tc>
         <w:tc>
           <w:tcPr>
-            <w:tcW w:type="dxa" w:w="3000"/>
+            <w:tcW w:type="dxa" w:w="3200"/>
             <w:tcMar>
               <w:top w:type="dxa" w:w="60"/>
               <w:left w:type="dxa" w:w="90"/>
@@ -30781,7 +30899,7 @@
         </w:tc>
         <w:tc>
           <w:tcPr>
-            <w:tcW w:type="dxa" w:w="700"/>
+            <w:tcW w:type="dxa" w:w="600"/>
             <w:tcMar>
               <w:top w:type="dxa" w:w="60"/>
               <w:left w:type="dxa" w:w="90"/>
@@ -30811,61 +30929,213 @@
         </w:tc>
         <w:tc>
           <w:tcPr>
-            <w:tcW w:type="dxa" w:w="1900"/>
-            <w:tcMar>
-              <w:top w:type="dxa" w:w="60"/>
-              <w:left w:type="dxa" w:w="90"/>
-              <w:bottom w:type="dxa" w:w="60"/>
-              <w:right w:type="dxa" w:w="90"/>
-            </w:tcMar>
-          </w:tcPr>
-          <w:p>
-            <w:pPr>
-              <w:spacing w:line="240"/>
-              <w:jc w:val="left"/>
-            </w:pPr>
-            <w:r>
-              <w:rPr>
-                <w:rFonts w:ascii="Arial" w:cs="Arial" w:eastAsia="Arial" w:hAnsi="Arial"/>
-                <w:b w:val="false"/>
-                <w:bCs w:val="false"/>
-                <w:i w:val="false"/>
-                <w:iCs w:val="false"/>
-                <w:caps w:val="false"/>
-                <w:sz w:val="20"/>
-                <w:szCs w:val="20"/>
-              </w:rPr>
-              <w:t xml:space="preserve">Total</w:t>
-            </w:r>
-          </w:p>
-        </w:tc>
-        <w:tc>
-          <w:tcPr>
-            <w:tcW w:type="dxa" w:w="1900"/>
-            <w:tcMar>
-              <w:top w:type="dxa" w:w="60"/>
-              <w:left w:type="dxa" w:w="90"/>
-              <w:bottom w:type="dxa" w:w="60"/>
-              <w:right w:type="dxa" w:w="90"/>
-            </w:tcMar>
-          </w:tcPr>
-          <w:p>
-            <w:pPr>
-              <w:spacing w:line="240"/>
-              <w:jc w:val="left"/>
-            </w:pPr>
-            <w:r>
-              <w:rPr>
-                <w:rFonts w:ascii="Arial" w:cs="Arial" w:eastAsia="Arial" w:hAnsi="Arial"/>
-                <w:b w:val="false"/>
-                <w:bCs w:val="false"/>
-                <w:i w:val="false"/>
-                <w:iCs w:val="false"/>
-                <w:caps w:val="false"/>
-                <w:sz w:val="20"/>
-                <w:szCs w:val="20"/>
-              </w:rPr>
-              <w:t xml:space="preserve">A preencher</w:t>
+            <w:tcW w:type="dxa" w:w="1800"/>
+            <w:tcMar>
+              <w:top w:type="dxa" w:w="60"/>
+              <w:left w:type="dxa" w:w="90"/>
+              <w:bottom w:type="dxa" w:w="60"/>
+              <w:right w:type="dxa" w:w="90"/>
+            </w:tcMar>
+          </w:tcPr>
+          <w:p>
+            <w:pPr>
+              <w:spacing w:line="240"/>
+              <w:jc w:val="left"/>
+            </w:pPr>
+            <w:r>
+              <w:rPr>
+                <w:rFonts w:ascii="Arial" w:cs="Arial" w:eastAsia="Arial" w:hAnsi="Arial"/>
+                <w:b w:val="false"/>
+                <w:bCs w:val="false"/>
+                <w:i w:val="false"/>
+                <w:iCs w:val="false"/>
+                <w:caps w:val="false"/>
+                <w:sz w:val="20"/>
+                <w:szCs w:val="20"/>
+              </w:rPr>
+              <w:t xml:space="preserve">Subtotal de bancada</w:t>
+            </w:r>
+          </w:p>
+        </w:tc>
+        <w:tc>
+          <w:tcPr>
+            <w:tcW w:type="dxa" w:w="1500"/>
+            <w:tcMar>
+              <w:top w:type="dxa" w:w="60"/>
+              <w:left w:type="dxa" w:w="90"/>
+              <w:bottom w:type="dxa" w:w="60"/>
+              <w:right w:type="dxa" w:w="90"/>
+            </w:tcMar>
+          </w:tcPr>
+          <w:p>
+            <w:pPr>
+              <w:spacing w:line="240"/>
+              <w:jc w:val="left"/>
+            </w:pPr>
+            <w:r>
+              <w:rPr>
+                <w:rFonts w:ascii="Arial" w:cs="Arial" w:eastAsia="Arial" w:hAnsi="Arial"/>
+                <w:b w:val="false"/>
+                <w:bCs w:val="false"/>
+                <w:i w:val="false"/>
+                <w:iCs w:val="false"/>
+                <w:caps w:val="false"/>
+                <w:sz w:val="20"/>
+                <w:szCs w:val="20"/>
+              </w:rPr>
+              <w:t xml:space="preserve">104,80</w:t>
+            </w:r>
+          </w:p>
+        </w:tc>
+      </w:tr>
+      <w:tr>
+        <w:tc>
+          <w:tcPr>
+            <w:tcW w:type="dxa" w:w="2200"/>
+            <w:tcMar>
+              <w:top w:type="dxa" w:w="60"/>
+              <w:left w:type="dxa" w:w="90"/>
+              <w:bottom w:type="dxa" w:w="60"/>
+              <w:right w:type="dxa" w:w="90"/>
+            </w:tcMar>
+          </w:tcPr>
+          <w:p>
+            <w:pPr>
+              <w:spacing w:line="240"/>
+              <w:jc w:val="left"/>
+            </w:pPr>
+            <w:r>
+              <w:rPr>
+                <w:rFonts w:ascii="Arial" w:cs="Arial" w:eastAsia="Arial" w:hAnsi="Arial"/>
+                <w:b w:val="false"/>
+                <w:bCs w:val="false"/>
+                <w:i w:val="false"/>
+                <w:iCs w:val="false"/>
+                <w:caps w:val="false"/>
+                <w:sz w:val="20"/>
+                <w:szCs w:val="20"/>
+              </w:rPr>
+              <w:t xml:space="preserve"/>
+            </w:r>
+          </w:p>
+        </w:tc>
+        <w:tc>
+          <w:tcPr>
+            <w:tcW w:type="dxa" w:w="3200"/>
+            <w:tcMar>
+              <w:top w:type="dxa" w:w="60"/>
+              <w:left w:type="dxa" w:w="90"/>
+              <w:bottom w:type="dxa" w:w="60"/>
+              <w:right w:type="dxa" w:w="90"/>
+            </w:tcMar>
+          </w:tcPr>
+          <w:p>
+            <w:pPr>
+              <w:spacing w:line="240"/>
+              <w:jc w:val="left"/>
+            </w:pPr>
+            <w:r>
+              <w:rPr>
+                <w:rFonts w:ascii="Arial" w:cs="Arial" w:eastAsia="Arial" w:hAnsi="Arial"/>
+                <w:b w:val="false"/>
+                <w:bCs w:val="false"/>
+                <w:i w:val="false"/>
+                <w:iCs w:val="false"/>
+                <w:caps w:val="false"/>
+                <w:sz w:val="20"/>
+                <w:szCs w:val="20"/>
+              </w:rPr>
+              <w:t xml:space="preserve"/>
+            </w:r>
+          </w:p>
+        </w:tc>
+        <w:tc>
+          <w:tcPr>
+            <w:tcW w:type="dxa" w:w="600"/>
+            <w:tcMar>
+              <w:top w:type="dxa" w:w="60"/>
+              <w:left w:type="dxa" w:w="90"/>
+              <w:bottom w:type="dxa" w:w="60"/>
+              <w:right w:type="dxa" w:w="90"/>
+            </w:tcMar>
+          </w:tcPr>
+          <w:p>
+            <w:pPr>
+              <w:spacing w:line="240"/>
+              <w:jc w:val="left"/>
+            </w:pPr>
+            <w:r>
+              <w:rPr>
+                <w:rFonts w:ascii="Arial" w:cs="Arial" w:eastAsia="Arial" w:hAnsi="Arial"/>
+                <w:b w:val="false"/>
+                <w:bCs w:val="false"/>
+                <w:i w:val="false"/>
+                <w:iCs w:val="false"/>
+                <w:caps w:val="false"/>
+                <w:sz w:val="20"/>
+                <w:szCs w:val="20"/>
+              </w:rPr>
+              <w:t xml:space="preserve"/>
+            </w:r>
+          </w:p>
+        </w:tc>
+        <w:tc>
+          <w:tcPr>
+            <w:tcW w:type="dxa" w:w="1800"/>
+            <w:tcMar>
+              <w:top w:type="dxa" w:w="60"/>
+              <w:left w:type="dxa" w:w="90"/>
+              <w:bottom w:type="dxa" w:w="60"/>
+              <w:right w:type="dxa" w:w="90"/>
+            </w:tcMar>
+          </w:tcPr>
+          <w:p>
+            <w:pPr>
+              <w:spacing w:line="240"/>
+              <w:jc w:val="left"/>
+            </w:pPr>
+            <w:r>
+              <w:rPr>
+                <w:rFonts w:ascii="Arial" w:cs="Arial" w:eastAsia="Arial" w:hAnsi="Arial"/>
+                <w:b w:val="false"/>
+                <w:bCs w:val="false"/>
+                <w:i w:val="false"/>
+                <w:iCs w:val="false"/>
+                <w:caps w:val="false"/>
+                <w:sz w:val="20"/>
+                <w:szCs w:val="20"/>
+              </w:rPr>
+              <w:t xml:space="preserve">Total geral</w:t>
+            </w:r>
+          </w:p>
+        </w:tc>
+        <w:tc>
+          <w:tcPr>
+            <w:tcW w:type="dxa" w:w="1500"/>
+            <w:tcMar>
+              <w:top w:type="dxa" w:w="60"/>
+              <w:left w:type="dxa" w:w="90"/>
+              <w:bottom w:type="dxa" w:w="60"/>
+              <w:right w:type="dxa" w:w="90"/>
+            </w:tcMar>
+          </w:tcPr>
+          <w:p>
+            <w:pPr>
+              <w:spacing w:line="240"/>
+              <w:jc w:val="left"/>
+            </w:pPr>
+            <w:r>
+              <w:rPr>
+                <w:rFonts w:ascii="Arial" w:cs="Arial" w:eastAsia="Arial" w:hAnsi="Arial"/>
+                <w:b w:val="false"/>
+                <w:bCs w:val="false"/>
+                <w:i w:val="false"/>
+                <w:iCs w:val="false"/>
+                <w:caps w:val="false"/>
+                <w:sz w:val="20"/>
+                <w:szCs w:val="20"/>
+              </w:rPr>
+              <w:t xml:space="preserve">256,88</w:t>
             </w:r>
           </w:p>
         </w:tc>
@@ -30887,26 +31157,87 @@
           <w:sz w:val="20"/>
           <w:szCs w:val="20"/>
         </w:rPr>
-        <w:t xml:space="preserve">Fonte: Elaborado pelos autores (2026).</w:t>
-      </w:r>
-    </w:p>
-    <w:p>
-      <w:pPr>
-        <w:spacing w:after="240" w:before="240" w:line="360"/>
-        <w:jc w:val="center"/>
-      </w:pPr>
-      <w:r>
-        <w:rPr>
-          <w:rFonts w:ascii="Arial" w:cs="Arial" w:eastAsia="Arial" w:hAnsi="Arial"/>
-          <w:b/>
-          <w:bCs/>
-          <w:i w:val="false"/>
-          <w:iCs w:val="false"/>
-          <w:caps w:val="false"/>
-          <w:sz w:val="24"/>
-          <w:szCs w:val="24"/>
-        </w:rPr>
-        <w:t xml:space="preserve">[A PREENCHER: valores de aquisição dos componentes]</w:t>
+        <w:t xml:space="preserve">Fonte: Elaborado pelos autores (2026). Valores de aquisição praticados em agosto de 2026.</w:t>
+      </w:r>
+    </w:p>
+    <w:p>
+      <w:pPr>
+        <w:spacing w:after="0" w:before="0" w:line="360"/>
+        <w:ind w:firstLine="708"/>
+        <w:jc w:val="both"/>
+      </w:pPr>
+      <w:r>
+        <w:rPr>
+          <w:rFonts w:ascii="Arial" w:cs="Arial" w:eastAsia="Arial" w:hAnsi="Arial"/>
+          <w:b w:val="false"/>
+          <w:bCs w:val="false"/>
+          <w:i w:val="false"/>
+          <w:iCs w:val="false"/>
+          <w:caps w:val="false"/>
+          <w:sz w:val="24"/>
+          <w:szCs w:val="24"/>
+        </w:rPr>
+        <w:t xml:space="preserve">Os valores registrados no Quadro 18 correspondem aos preços efetivamente praticados na aquisição, em agosto de 2026, junto a fornecedores do mercado nacional. Os itens adquiridos em embalagens múltiplas — jumpers, bornes, resistores e capacitores — foram contabilizados pelo valor unitário correspondente à quantidade efetivamente empregada, e não pelo valor da embalagem, de modo a refletir o custo real de reprodução de uma unidade do sistema.</w:t>
+      </w:r>
+    </w:p>
+    <w:p>
+      <w:pPr>
+        <w:spacing w:after="0" w:before="0" w:line="360"/>
+        <w:ind w:firstLine="708"/>
+        <w:jc w:val="both"/>
+      </w:pPr>
+      <w:r>
+        <w:rPr>
+          <w:rFonts w:ascii="Arial" w:cs="Arial" w:eastAsia="Arial" w:hAnsi="Arial"/>
+          <w:b w:val="false"/>
+          <w:bCs w:val="false"/>
+          <w:i w:val="false"/>
+          <w:iCs w:val="false"/>
+          <w:caps w:val="false"/>
+          <w:sz w:val="24"/>
+          <w:szCs w:val="24"/>
+        </w:rPr>
+        <w:t xml:space="preserve">O subtotal do nó de medição, de R$ 152,08, atende ao requisito não funcional RNF01, que estabelece o limite de R$ 200,00 para os componentes de hardware de um nó. A margem remanescente é suficiente para a inclusão de um segundo ponto de medição sem que o custo por nó exceda o teto estabelecido.</w:t>
+      </w:r>
+    </w:p>
+    <w:p>
+      <w:pPr>
+        <w:spacing w:after="0" w:before="0" w:line="360"/>
+        <w:ind w:firstLine="708"/>
+        <w:jc w:val="both"/>
+      </w:pPr>
+      <w:r>
+        <w:rPr>
+          <w:rFonts w:ascii="Arial" w:cs="Arial" w:eastAsia="Arial" w:hAnsi="Arial"/>
+          <w:b w:val="false"/>
+          <w:bCs w:val="false"/>
+          <w:i w:val="false"/>
+          <w:iCs w:val="false"/>
+          <w:caps w:val="false"/>
+          <w:sz w:val="24"/>
+          <w:szCs w:val="24"/>
+        </w:rPr>
+        <w:t xml:space="preserve">O subtotal de bancada, de R$ 104,80, compreende o instrumento de referência utilizado na calibração e na verificação da hipótese H1 e o circuito sobre o qual a instrumentação foi aplicada. Esses itens não integram o nó replicável: em uma implantação com múltiplos pontos de medição, o instrumento de referência é utilizado uma única vez, na etapa de calibração, e o circuito instrumentado é a própria instalação existente.</w:t>
+      </w:r>
+    </w:p>
+    <w:p>
+      <w:pPr>
+        <w:spacing w:after="0" w:before="0" w:line="360"/>
+        <w:ind w:firstLine="708"/>
+        <w:jc w:val="both"/>
+      </w:pPr>
+      <w:r>
+        <w:rPr>
+          <w:rFonts w:ascii="Arial" w:cs="Arial" w:eastAsia="Arial" w:hAnsi="Arial"/>
+          <w:b w:val="false"/>
+          <w:bCs w:val="false"/>
+          <w:i w:val="false"/>
+          <w:iCs w:val="false"/>
+          <w:caps w:val="false"/>
+          <w:sz w:val="24"/>
+          <w:szCs w:val="24"/>
+        </w:rPr>
+        <w:t xml:space="preserve">O custo total de R$ 256,88 sustenta a afirmação de viabilidade econômica apresentada na justificativa deste trabalho e caracteriza a solução como reprodutível sem barreira significativa de investimento inicial.</w:t>
       </w:r>
     </w:p>
     <w:sectPr>

</xml_diff>